<commit_message>
Correccion 07 - Ya subi devoluciones hasta Perezlindo
</commit_message>
<xml_diff>
--- a/Practicos/Notas y Devoluciones 07.docx
+++ b/Practicos/Notas y Devoluciones 07.docx
@@ -1,6 +1,6 @@
 
 <file path=word/document.xml><?xml version="1.0" encoding="utf-8"?>
-<w:document xmlns:wpc="http://schemas.microsoft.com/office/word/2010/wordprocessingCanvas" xmlns:cx="http://schemas.microsoft.com/office/drawing/2014/chartex" xmlns:cx1="http://schemas.microsoft.com/office/drawing/2015/9/8/chartex" xmlns:cx2="http://schemas.microsoft.com/office/drawing/2015/10/21/chartex" xmlns:cx3="http://schemas.microsoft.com/office/drawing/2016/5/9/chartex" xmlns:cx4="http://schemas.microsoft.com/office/drawing/2016/5/10/chartex" xmlns:cx5="http://schemas.microsoft.com/office/drawing/2016/5/11/chartex" xmlns:cx6="http://schemas.microsoft.com/office/drawing/2016/5/12/chartex" xmlns:cx7="http://schemas.microsoft.com/office/drawing/2016/5/13/chartex" xmlns:cx8="http://schemas.microsoft.com/office/drawing/2016/5/14/chartex" xmlns:mc="http://schemas.openxmlformats.org/markup-compatibility/2006" xmlns:aink="http://schemas.microsoft.com/office/drawing/2016/ink" xmlns:am3d="http://schemas.microsoft.com/office/drawing/2017/model3d" xmlns:o="urn:schemas-microsoft-com:office:office" xmlns:oel="http://schemas.microsoft.com/office/2019/extlst" xmlns:r="http://schemas.openxmlformats.org/officeDocument/2006/relationships" xmlns:m="http://schemas.openxmlformats.org/officeDocument/2006/math" xmlns:v="urn:schemas-microsoft-com:vml" xmlns:wp14="http://schemas.microsoft.com/office/word/2010/wordprocessingDrawing" xmlns:wp="http://schemas.openxmlformats.org/drawingml/2006/wordprocessingDrawing" xmlns:w10="urn:schemas-microsoft-com:office:word" xmlns:w="http://schemas.openxmlformats.org/wordprocessingml/2006/main" xmlns:w14="http://schemas.microsoft.com/office/word/2010/wordml" xmlns:w15="http://schemas.microsoft.com/office/word/2012/wordml" xmlns:w16cei="http://schemas.microsoft.com/office/word/2026/wordml/cei" xmlns:w16cex="http://schemas.microsoft.com/office/word/2018/wordml/cex" xmlns:w16cid="http://schemas.microsoft.com/office/word/2016/wordml/cid" xmlns:w16="http://schemas.microsoft.com/office/word/2018/wordml" xmlns:w16du="http://schemas.microsoft.com/office/word/2023/wordml/word16du" xmlns:w16sdtdh="http://schemas.microsoft.com/office/word/2020/wordml/sdtdatahash" xmlns:w16sdtfl="http://schemas.microsoft.com/office/word/2024/wordml/sdtformatlock" xmlns:w16se="http://schemas.microsoft.com/office/word/2015/wordml/symex" xmlns:wpg="http://schemas.microsoft.com/office/word/2010/wordprocessingGroup" xmlns:wpi="http://schemas.microsoft.com/office/word/2010/wordprocessingInk" xmlns:wne="http://schemas.microsoft.com/office/word/2006/wordml" xmlns:wps="http://schemas.microsoft.com/office/word/2010/wordprocessingShape" mc:Ignorable="w14 w15 w16se w16cid w16 w16cex w16sdtdh w16sdtfl w16du wp14">
+<w:document xmlns:wpc="http://schemas.microsoft.com/office/word/2010/wordprocessingCanvas" xmlns:cx="http://schemas.microsoft.com/office/drawing/2014/chartex" xmlns:cx1="http://schemas.microsoft.com/office/drawing/2015/9/8/chartex" xmlns:cx2="http://schemas.microsoft.com/office/drawing/2015/10/21/chartex" xmlns:cx3="http://schemas.microsoft.com/office/drawing/2016/5/9/chartex" xmlns:cx4="http://schemas.microsoft.com/office/drawing/2016/5/10/chartex" xmlns:cx5="http://schemas.microsoft.com/office/drawing/2016/5/11/chartex" xmlns:cx6="http://schemas.microsoft.com/office/drawing/2016/5/12/chartex" xmlns:cx7="http://schemas.microsoft.com/office/drawing/2016/5/13/chartex" xmlns:cx8="http://schemas.microsoft.com/office/drawing/2016/5/14/chartex" xmlns:mc="http://schemas.openxmlformats.org/markup-compatibility/2006" xmlns:aink="http://schemas.microsoft.com/office/drawing/2016/ink" xmlns:am3d="http://schemas.microsoft.com/office/drawing/2017/model3d" xmlns:o="urn:schemas-microsoft-com:office:office" xmlns:oel="http://schemas.microsoft.com/office/2019/extlst" xmlns:r="http://schemas.openxmlformats.org/officeDocument/2006/relationships" xmlns:m="http://schemas.openxmlformats.org/officeDocument/2006/math" xmlns:v="urn:schemas-microsoft-com:vml" xmlns:wp14="http://schemas.microsoft.com/office/word/2010/wordprocessingDrawing" xmlns:wp="http://schemas.openxmlformats.org/drawingml/2006/wordprocessingDrawing" xmlns:w10="urn:schemas-microsoft-com:office:word" xmlns:w="http://schemas.openxmlformats.org/wordprocessingml/2006/main" xmlns:w14="http://schemas.microsoft.com/office/word/2010/wordml" xmlns:w15="http://schemas.microsoft.com/office/word/2012/wordml" xmlns:w16cex="http://schemas.microsoft.com/office/word/2018/wordml/cex" xmlns:w16cid="http://schemas.microsoft.com/office/word/2016/wordml/cid" xmlns:w16="http://schemas.microsoft.com/office/word/2018/wordml" xmlns:w16sdtdh="http://schemas.microsoft.com/office/word/2020/wordml/sdtdatahash" xmlns:w16se="http://schemas.microsoft.com/office/word/2015/wordml/symex" xmlns:wpg="http://schemas.microsoft.com/office/word/2010/wordprocessingGroup" xmlns:wpi="http://schemas.microsoft.com/office/word/2010/wordprocessingInk" xmlns:wne="http://schemas.microsoft.com/office/word/2006/wordml" xmlns:wps="http://schemas.microsoft.com/office/word/2010/wordprocessingShape" mc:Ignorable="w14 w15 w16se w16cid w16 w16cex w16sdtdh wp14">
   <w:body>
     <w:p>
       <w:pPr>
@@ -35,6 +35,7 @@
           <w:rFonts w:ascii="Segoe UI Emoji" w:hAnsi="Segoe UI Emoji" w:cs="Segoe UI Emoji"/>
         </w:rPr>
       </w:pPr>
+      <w:proofErr w:type="gramStart"/>
       <w:r>
         <w:rPr>
           <w:rFonts w:ascii="Segoe UI Emoji" w:hAnsi="Segoe UI Emoji" w:cs="Segoe UI Emoji"/>
@@ -42,7 +43,11 @@
         <w:t>🎉</w:t>
       </w:r>
       <w:r>
-        <w:t xml:space="preserve">¡Felicitaciones por la entrega del Desafío 07! </w:t>
+        <w:t>¡</w:t>
+      </w:r>
+      <w:proofErr w:type="gramEnd"/>
+      <w:r>
+        <w:t xml:space="preserve">Felicitaciones por la entrega del Desafío 07! </w:t>
       </w:r>
       <w:r>
         <w:rPr>
@@ -54,16 +59,37 @@
     <w:p/>
     <w:p>
       <w:r>
-        <w:t>Facundo</w:t>
-      </w:r>
-      <w:r>
-        <w:t>, excelente trabajo, te felicito por el compromiso en realizar las entregas.</w:t>
-      </w:r>
-    </w:p>
-    <w:p/>
-    <w:p>
-      <w:r>
-        <w:t xml:space="preserve">Excelente la implementación de métodos para recorrer para arrays y objetos, diferenciaste correctamente los métodos splice y slice. </w:t>
+        <w:t>Facundo, excelente trabajo, te felicito por el compromiso en realizar las entregas.</w:t>
+      </w:r>
+    </w:p>
+    <w:p/>
+    <w:p>
+      <w:r>
+        <w:t xml:space="preserve">Excelente la implementación de métodos para recorrer para </w:t>
+      </w:r>
+      <w:proofErr w:type="spellStart"/>
+      <w:r>
+        <w:t>arrays</w:t>
+      </w:r>
+      <w:proofErr w:type="spellEnd"/>
+      <w:r>
+        <w:t xml:space="preserve"> y objetos, diferenciaste correctamente los métodos </w:t>
+      </w:r>
+      <w:proofErr w:type="spellStart"/>
+      <w:r>
+        <w:t>splice</w:t>
+      </w:r>
+      <w:proofErr w:type="spellEnd"/>
+      <w:r>
+        <w:t xml:space="preserve"> y </w:t>
+      </w:r>
+      <w:proofErr w:type="spellStart"/>
+      <w:r>
+        <w:t>slice</w:t>
+      </w:r>
+      <w:proofErr w:type="spellEnd"/>
+      <w:r>
+        <w:t xml:space="preserve">. </w:t>
       </w:r>
     </w:p>
     <w:p/>
@@ -75,16 +101,45 @@
     <w:p/>
     <w:p>
       <w:r>
-        <w:t xml:space="preserve">Buenísimo que te manejaste con template literals en lugar de concatenar strings. </w:t>
-      </w:r>
-    </w:p>
-    <w:p/>
-    <w:p>
-      <w:r>
-        <w:t>Quiero destacar la prolijidad de tu código</w:t>
-      </w:r>
-      <w:r>
-        <w:t xml:space="preserve"> y que completaste el punto adicional en el ultimo ejercicio ¡</w:t>
+        <w:t xml:space="preserve">Buenísimo que te manejaste con </w:t>
+      </w:r>
+      <w:proofErr w:type="spellStart"/>
+      <w:r>
+        <w:t>template</w:t>
+      </w:r>
+      <w:proofErr w:type="spellEnd"/>
+      <w:r>
+        <w:t xml:space="preserve"> </w:t>
+      </w:r>
+      <w:proofErr w:type="spellStart"/>
+      <w:r>
+        <w:t>literals</w:t>
+      </w:r>
+      <w:proofErr w:type="spellEnd"/>
+      <w:r>
+        <w:t xml:space="preserve"> en lugar de concatenar </w:t>
+      </w:r>
+      <w:proofErr w:type="spellStart"/>
+      <w:r>
+        <w:t>strings</w:t>
+      </w:r>
+      <w:proofErr w:type="spellEnd"/>
+      <w:r>
+        <w:t xml:space="preserve">. </w:t>
+      </w:r>
+    </w:p>
+    <w:p/>
+    <w:p>
+      <w:r>
+        <w:t xml:space="preserve">Quiero destacar la prolijidad de tu código y que completaste el punto adicional en el </w:t>
+      </w:r>
+      <w:proofErr w:type="spellStart"/>
+      <w:r>
+        <w:t>ultimo</w:t>
+      </w:r>
+      <w:proofErr w:type="spellEnd"/>
+      <w:r>
+        <w:t xml:space="preserve"> ejercicio ¡</w:t>
       </w:r>
     </w:p>
     <w:p/>
@@ -104,7 +159,15 @@
         </w:numPr>
       </w:pPr>
       <w:r>
-        <w:t>Me hubiera gustado que utilices al operador ternario, por ejemplo, en el ejercicio nro 5:</w:t>
+        <w:t xml:space="preserve">Me hubiera gustado que utilices al operador ternario, por ejemplo, en el ejercicio </w:t>
+      </w:r>
+      <w:proofErr w:type="spellStart"/>
+      <w:r>
+        <w:t>nro</w:t>
+      </w:r>
+      <w:proofErr w:type="spellEnd"/>
+      <w:r>
+        <w:t xml:space="preserve"> 5:</w:t>
       </w:r>
       <w:r>
         <w:tab/>
@@ -115,16 +178,42 @@
       <w:pPr>
         <w:ind w:left="1416"/>
       </w:pPr>
-      <w:r>
-        <w:t>const estado = promedio &gt;= 6 ? "Aprobado" : "Reprobado";</w:t>
+      <w:proofErr w:type="spellStart"/>
+      <w:r>
+        <w:t>const</w:t>
+      </w:r>
+      <w:proofErr w:type="spellEnd"/>
+      <w:r>
+        <w:t xml:space="preserve"> estado = promedio &gt;= </w:t>
+      </w:r>
+      <w:proofErr w:type="gramStart"/>
+      <w:r>
+        <w:t>6 ?</w:t>
+      </w:r>
+      <w:proofErr w:type="gramEnd"/>
+      <w:r>
+        <w:t xml:space="preserve"> "Aprobado</w:t>
+      </w:r>
+      <w:proofErr w:type="gramStart"/>
+      <w:r>
+        <w:t>" :</w:t>
+      </w:r>
+      <w:proofErr w:type="gramEnd"/>
+      <w:r>
+        <w:t xml:space="preserve"> "Reprobado";</w:t>
       </w:r>
     </w:p>
     <w:p>
       <w:pPr>
         <w:ind w:left="1416"/>
       </w:pPr>
-      <w:r>
-        <w:t>console.log(`Estado: ${estado}`);</w:t>
+      <w:proofErr w:type="gramStart"/>
+      <w:r>
+        <w:t>console.log(</w:t>
+      </w:r>
+      <w:proofErr w:type="gramEnd"/>
+      <w:r>
+        <w:t>`Estado: ${estado}`);</w:t>
       </w:r>
     </w:p>
     <w:p>
@@ -176,6 +265,7 @@
           <w:bCs/>
         </w:rPr>
       </w:pPr>
+      <w:proofErr w:type="spellStart"/>
       <w:r>
         <w:rPr>
           <w:rFonts w:ascii="Segoe UI Emoji" w:hAnsi="Segoe UI Emoji" w:cs="Segoe UI Emoji"/>
@@ -198,24 +288,44 @@
           <w:b/>
           <w:bCs/>
         </w:rPr>
-        <w:t>lez Diego Gaston</w:t>
-      </w:r>
-    </w:p>
-    <w:p>
-      <w:pPr>
-        <w:rPr>
-          <w:rFonts w:ascii="Segoe UI Emoji" w:hAnsi="Segoe UI Emoji" w:cs="Segoe UI Emoji"/>
-          <w:b/>
-          <w:bCs/>
-        </w:rPr>
-      </w:pPr>
-    </w:p>
-    <w:p>
-      <w:pPr>
-        <w:rPr>
-          <w:rFonts w:ascii="Segoe UI Emoji" w:hAnsi="Segoe UI Emoji" w:cs="Segoe UI Emoji"/>
-        </w:rPr>
-      </w:pPr>
+        <w:t>lez</w:t>
+      </w:r>
+      <w:proofErr w:type="spellEnd"/>
+      <w:r>
+        <w:rPr>
+          <w:rFonts w:ascii="Segoe UI Emoji" w:hAnsi="Segoe UI Emoji" w:cs="Segoe UI Emoji"/>
+          <w:b/>
+          <w:bCs/>
+        </w:rPr>
+        <w:t xml:space="preserve"> Diego </w:t>
+      </w:r>
+      <w:proofErr w:type="spellStart"/>
+      <w:r>
+        <w:rPr>
+          <w:rFonts w:ascii="Segoe UI Emoji" w:hAnsi="Segoe UI Emoji" w:cs="Segoe UI Emoji"/>
+          <w:b/>
+          <w:bCs/>
+        </w:rPr>
+        <w:t>Gaston</w:t>
+      </w:r>
+      <w:proofErr w:type="spellEnd"/>
+    </w:p>
+    <w:p>
+      <w:pPr>
+        <w:rPr>
+          <w:rFonts w:ascii="Segoe UI Emoji" w:hAnsi="Segoe UI Emoji" w:cs="Segoe UI Emoji"/>
+          <w:b/>
+          <w:bCs/>
+        </w:rPr>
+      </w:pPr>
+    </w:p>
+    <w:p>
+      <w:pPr>
+        <w:rPr>
+          <w:rFonts w:ascii="Segoe UI Emoji" w:hAnsi="Segoe UI Emoji" w:cs="Segoe UI Emoji"/>
+        </w:rPr>
+      </w:pPr>
+      <w:proofErr w:type="gramStart"/>
       <w:r>
         <w:rPr>
           <w:rFonts w:ascii="Segoe UI Emoji" w:hAnsi="Segoe UI Emoji" w:cs="Segoe UI Emoji"/>
@@ -223,7 +333,11 @@
         <w:t>🎉</w:t>
       </w:r>
       <w:r>
-        <w:t xml:space="preserve">¡Felicitaciones por la entrega del Desafío 05! </w:t>
+        <w:t>¡</w:t>
+      </w:r>
+      <w:proofErr w:type="gramEnd"/>
+      <w:r>
+        <w:t xml:space="preserve">Felicitaciones por la entrega del Desafío 05! </w:t>
       </w:r>
       <w:r>
         <w:rPr>
@@ -250,10 +364,50 @@
     <w:p/>
     <w:p>
       <w:r>
-        <w:t xml:space="preserve">La declaración y uso de variables let y const esta </w:t>
-      </w:r>
-      <w:r>
-        <w:t>impecable, destaco que supiste cuando utilizar variables const, como pro ejemplo con datos como el “iva” que son valores que no cambian a lo largo del documento.</w:t>
+        <w:t xml:space="preserve">La declaración y uso de variables </w:t>
+      </w:r>
+      <w:proofErr w:type="spellStart"/>
+      <w:r>
+        <w:t>let</w:t>
+      </w:r>
+      <w:proofErr w:type="spellEnd"/>
+      <w:r>
+        <w:t xml:space="preserve"> y </w:t>
+      </w:r>
+      <w:proofErr w:type="spellStart"/>
+      <w:r>
+        <w:t>const</w:t>
+      </w:r>
+      <w:proofErr w:type="spellEnd"/>
+      <w:r>
+        <w:t xml:space="preserve"> esta </w:t>
+      </w:r>
+      <w:r>
+        <w:t xml:space="preserve">impecable, destaco que supiste cuando utilizar variables </w:t>
+      </w:r>
+      <w:proofErr w:type="spellStart"/>
+      <w:r>
+        <w:t>const</w:t>
+      </w:r>
+      <w:proofErr w:type="spellEnd"/>
+      <w:r>
+        <w:t xml:space="preserve">, como </w:t>
+      </w:r>
+      <w:proofErr w:type="spellStart"/>
+      <w:r>
+        <w:t>pro</w:t>
+      </w:r>
+      <w:proofErr w:type="spellEnd"/>
+      <w:r>
+        <w:t xml:space="preserve"> ejemplo con datos como el “</w:t>
+      </w:r>
+      <w:proofErr w:type="spellStart"/>
+      <w:r>
+        <w:t>iva</w:t>
+      </w:r>
+      <w:proofErr w:type="spellEnd"/>
+      <w:r>
+        <w:t>” que son valores que no cambian a lo largo del documento.</w:t>
       </w:r>
     </w:p>
     <w:p/>
@@ -277,7 +431,31 @@
     <w:p/>
     <w:p>
       <w:r>
-        <w:t>Buenísimo que te manejaste con template literals en lugar de concatenar strings.</w:t>
+        <w:t xml:space="preserve">Buenísimo que te manejaste con </w:t>
+      </w:r>
+      <w:proofErr w:type="spellStart"/>
+      <w:r>
+        <w:t>template</w:t>
+      </w:r>
+      <w:proofErr w:type="spellEnd"/>
+      <w:r>
+        <w:t xml:space="preserve"> </w:t>
+      </w:r>
+      <w:proofErr w:type="spellStart"/>
+      <w:r>
+        <w:t>literals</w:t>
+      </w:r>
+      <w:proofErr w:type="spellEnd"/>
+      <w:r>
+        <w:t xml:space="preserve"> en lugar de concatenar </w:t>
+      </w:r>
+      <w:proofErr w:type="spellStart"/>
+      <w:r>
+        <w:t>strings</w:t>
+      </w:r>
+      <w:proofErr w:type="spellEnd"/>
+      <w:r>
+        <w:t>.</w:t>
       </w:r>
     </w:p>
     <w:p/>
@@ -324,30 +502,51 @@
           <w:u w:val="single"/>
         </w:rPr>
       </w:pPr>
-      <w:r>
-        <w:rPr>
-          <w:rFonts w:ascii="Segoe UI Emoji" w:hAnsi="Segoe UI Emoji" w:cs="Segoe UI Emoji"/>
-          <w:b/>
-          <w:bCs/>
-        </w:rPr>
-        <w:t>Albarracin Agustin</w:t>
-      </w:r>
-    </w:p>
-    <w:p>
-      <w:pPr>
-        <w:rPr>
-          <w:rFonts w:ascii="Segoe UI Emoji" w:hAnsi="Segoe UI Emoji" w:cs="Segoe UI Emoji"/>
-          <w:b/>
-          <w:bCs/>
-        </w:rPr>
-      </w:pPr>
-    </w:p>
-    <w:p>
-      <w:pPr>
-        <w:rPr>
-          <w:rFonts w:ascii="Segoe UI Emoji" w:hAnsi="Segoe UI Emoji" w:cs="Segoe UI Emoji"/>
-        </w:rPr>
-      </w:pPr>
+      <w:proofErr w:type="spellStart"/>
+      <w:r>
+        <w:rPr>
+          <w:rFonts w:ascii="Segoe UI Emoji" w:hAnsi="Segoe UI Emoji" w:cs="Segoe UI Emoji"/>
+          <w:b/>
+          <w:bCs/>
+        </w:rPr>
+        <w:t>Albarracin</w:t>
+      </w:r>
+      <w:proofErr w:type="spellEnd"/>
+      <w:r>
+        <w:rPr>
+          <w:rFonts w:ascii="Segoe UI Emoji" w:hAnsi="Segoe UI Emoji" w:cs="Segoe UI Emoji"/>
+          <w:b/>
+          <w:bCs/>
+        </w:rPr>
+        <w:t xml:space="preserve"> </w:t>
+      </w:r>
+      <w:proofErr w:type="spellStart"/>
+      <w:r>
+        <w:rPr>
+          <w:rFonts w:ascii="Segoe UI Emoji" w:hAnsi="Segoe UI Emoji" w:cs="Segoe UI Emoji"/>
+          <w:b/>
+          <w:bCs/>
+        </w:rPr>
+        <w:t>Agustin</w:t>
+      </w:r>
+      <w:proofErr w:type="spellEnd"/>
+    </w:p>
+    <w:p>
+      <w:pPr>
+        <w:rPr>
+          <w:rFonts w:ascii="Segoe UI Emoji" w:hAnsi="Segoe UI Emoji" w:cs="Segoe UI Emoji"/>
+          <w:b/>
+          <w:bCs/>
+        </w:rPr>
+      </w:pPr>
+    </w:p>
+    <w:p>
+      <w:pPr>
+        <w:rPr>
+          <w:rFonts w:ascii="Segoe UI Emoji" w:hAnsi="Segoe UI Emoji" w:cs="Segoe UI Emoji"/>
+        </w:rPr>
+      </w:pPr>
+      <w:proofErr w:type="gramStart"/>
       <w:r>
         <w:rPr>
           <w:rFonts w:ascii="Segoe UI Emoji" w:hAnsi="Segoe UI Emoji" w:cs="Segoe UI Emoji"/>
@@ -355,7 +554,11 @@
         <w:t>🎉</w:t>
       </w:r>
       <w:r>
-        <w:t xml:space="preserve">¡Felicitaciones por la entrega del Desafío 07! </w:t>
+        <w:t>¡</w:t>
+      </w:r>
+      <w:proofErr w:type="gramEnd"/>
+      <w:r>
+        <w:t xml:space="preserve">Felicitaciones por la entrega del Desafío 07! </w:t>
       </w:r>
       <w:r>
         <w:rPr>
@@ -366,23 +569,43 @@
     </w:p>
     <w:p/>
     <w:p>
+      <w:proofErr w:type="spellStart"/>
       <w:r>
         <w:t>Agustin</w:t>
       </w:r>
-      <w:r>
-        <w:t xml:space="preserve">, excelente </w:t>
-      </w:r>
-      <w:r>
-        <w:t>resultado</w:t>
-      </w:r>
-      <w:r>
-        <w:t>, te felicito por el compromiso en realizar las entregas.</w:t>
-      </w:r>
-    </w:p>
-    <w:p/>
-    <w:p>
-      <w:r>
-        <w:t xml:space="preserve">Excelente la implementación de métodos para recorrer para arrays y objetos, diferenciaste correctamente los métodos splice y slice. </w:t>
+      <w:proofErr w:type="spellEnd"/>
+      <w:r>
+        <w:t>, excelente resultado, te felicito por el compromiso en realizar las entregas.</w:t>
+      </w:r>
+    </w:p>
+    <w:p/>
+    <w:p>
+      <w:r>
+        <w:t xml:space="preserve">Excelente la implementación de métodos para recorrer para </w:t>
+      </w:r>
+      <w:proofErr w:type="spellStart"/>
+      <w:r>
+        <w:t>arrays</w:t>
+      </w:r>
+      <w:proofErr w:type="spellEnd"/>
+      <w:r>
+        <w:t xml:space="preserve"> y objetos, diferenciaste correctamente los métodos </w:t>
+      </w:r>
+      <w:proofErr w:type="spellStart"/>
+      <w:r>
+        <w:t>splice</w:t>
+      </w:r>
+      <w:proofErr w:type="spellEnd"/>
+      <w:r>
+        <w:t xml:space="preserve"> y </w:t>
+      </w:r>
+      <w:proofErr w:type="spellStart"/>
+      <w:r>
+        <w:t>slice</w:t>
+      </w:r>
+      <w:proofErr w:type="spellEnd"/>
+      <w:r>
+        <w:t xml:space="preserve">. </w:t>
       </w:r>
     </w:p>
     <w:p/>
@@ -394,10 +617,39 @@
     <w:p/>
     <w:p>
       <w:r>
-        <w:t xml:space="preserve">Buenísimo que te manejaste con template literals en lugar de concatenar strings. </w:t>
-      </w:r>
-      <w:r>
-        <w:t>Hubiera sido genial si aplicabas algún operador ternario, por ejemplo, en el ejercicio nro 5:</w:t>
+        <w:t xml:space="preserve">Buenísimo que te manejaste con </w:t>
+      </w:r>
+      <w:proofErr w:type="spellStart"/>
+      <w:r>
+        <w:t>template</w:t>
+      </w:r>
+      <w:proofErr w:type="spellEnd"/>
+      <w:r>
+        <w:t xml:space="preserve"> </w:t>
+      </w:r>
+      <w:proofErr w:type="spellStart"/>
+      <w:r>
+        <w:t>literals</w:t>
+      </w:r>
+      <w:proofErr w:type="spellEnd"/>
+      <w:r>
+        <w:t xml:space="preserve"> en lugar de concatenar </w:t>
+      </w:r>
+      <w:proofErr w:type="spellStart"/>
+      <w:r>
+        <w:t>strings</w:t>
+      </w:r>
+      <w:proofErr w:type="spellEnd"/>
+      <w:r>
+        <w:t xml:space="preserve">. Hubiera sido genial si aplicabas algún operador ternario, por ejemplo, en el ejercicio </w:t>
+      </w:r>
+      <w:proofErr w:type="spellStart"/>
+      <w:r>
+        <w:t>nro</w:t>
+      </w:r>
+      <w:proofErr w:type="spellEnd"/>
+      <w:r>
+        <w:t xml:space="preserve"> 5:</w:t>
       </w:r>
     </w:p>
     <w:p/>
@@ -405,16 +657,42 @@
       <w:pPr>
         <w:ind w:left="1416"/>
       </w:pPr>
-      <w:r>
-        <w:t>const estado = promedio &gt;= 6 ? "Aprobado" : "Reprobado";</w:t>
+      <w:proofErr w:type="spellStart"/>
+      <w:r>
+        <w:t>const</w:t>
+      </w:r>
+      <w:proofErr w:type="spellEnd"/>
+      <w:r>
+        <w:t xml:space="preserve"> estado = promedio &gt;= </w:t>
+      </w:r>
+      <w:proofErr w:type="gramStart"/>
+      <w:r>
+        <w:t>6 ?</w:t>
+      </w:r>
+      <w:proofErr w:type="gramEnd"/>
+      <w:r>
+        <w:t xml:space="preserve"> "Aprobado</w:t>
+      </w:r>
+      <w:proofErr w:type="gramStart"/>
+      <w:r>
+        <w:t>" :</w:t>
+      </w:r>
+      <w:proofErr w:type="gramEnd"/>
+      <w:r>
+        <w:t xml:space="preserve"> "Reprobado";</w:t>
       </w:r>
     </w:p>
     <w:p>
       <w:pPr>
         <w:ind w:left="1416"/>
       </w:pPr>
-      <w:r>
-        <w:t>console.log(`Estado: ${estado}`);</w:t>
+      <w:proofErr w:type="gramStart"/>
+      <w:r>
+        <w:t>console.log(</w:t>
+      </w:r>
+      <w:proofErr w:type="gramEnd"/>
+      <w:r>
+        <w:t>`Estado: ${estado}`);</w:t>
       </w:r>
     </w:p>
     <w:p/>
@@ -506,6 +784,7 @@
           <w:rFonts w:ascii="Segoe UI Emoji" w:hAnsi="Segoe UI Emoji" w:cs="Segoe UI Emoji"/>
         </w:rPr>
       </w:pPr>
+      <w:proofErr w:type="gramStart"/>
       <w:r>
         <w:rPr>
           <w:rFonts w:ascii="Segoe UI Emoji" w:hAnsi="Segoe UI Emoji" w:cs="Segoe UI Emoji"/>
@@ -513,7 +792,11 @@
         <w:t>🎉</w:t>
       </w:r>
       <w:r>
-        <w:t xml:space="preserve">¡Felicitaciones por la entrega del Desafío 07! </w:t>
+        <w:t>¡</w:t>
+      </w:r>
+      <w:proofErr w:type="gramEnd"/>
+      <w:r>
+        <w:t xml:space="preserve">Felicitaciones por la entrega del Desafío 07! </w:t>
       </w:r>
       <w:r>
         <w:rPr>
@@ -525,16 +808,37 @@
     <w:p/>
     <w:p>
       <w:r>
-        <w:t>Santiago</w:t>
-      </w:r>
-      <w:r>
-        <w:t>, excelente trabajo, te felicito por el compromiso en realizar las entregas.</w:t>
-      </w:r>
-    </w:p>
-    <w:p/>
-    <w:p>
-      <w:r>
-        <w:t xml:space="preserve">Excelente la implementación de métodos para recorrer para arrays y objetos, diferenciaste correctamente los métodos splice y slice. </w:t>
+        <w:t>Santiago, excelente trabajo, te felicito por el compromiso en realizar las entregas.</w:t>
+      </w:r>
+    </w:p>
+    <w:p/>
+    <w:p>
+      <w:r>
+        <w:t xml:space="preserve">Excelente la implementación de métodos para recorrer para </w:t>
+      </w:r>
+      <w:proofErr w:type="spellStart"/>
+      <w:r>
+        <w:t>arrays</w:t>
+      </w:r>
+      <w:proofErr w:type="spellEnd"/>
+      <w:r>
+        <w:t xml:space="preserve"> y objetos, diferenciaste correctamente los métodos </w:t>
+      </w:r>
+      <w:proofErr w:type="spellStart"/>
+      <w:r>
+        <w:t>splice</w:t>
+      </w:r>
+      <w:proofErr w:type="spellEnd"/>
+      <w:r>
+        <w:t xml:space="preserve"> y </w:t>
+      </w:r>
+      <w:proofErr w:type="spellStart"/>
+      <w:r>
+        <w:t>slice</w:t>
+      </w:r>
+      <w:proofErr w:type="spellEnd"/>
+      <w:r>
+        <w:t xml:space="preserve">. </w:t>
       </w:r>
     </w:p>
     <w:p/>
@@ -546,7 +850,31 @@
     <w:p/>
     <w:p>
       <w:r>
-        <w:t xml:space="preserve">Buenísimo que te manejaste con template literals en lugar de concatenar strings. </w:t>
+        <w:t xml:space="preserve">Buenísimo que te manejaste con </w:t>
+      </w:r>
+      <w:proofErr w:type="spellStart"/>
+      <w:r>
+        <w:t>template</w:t>
+      </w:r>
+      <w:proofErr w:type="spellEnd"/>
+      <w:r>
+        <w:t xml:space="preserve"> </w:t>
+      </w:r>
+      <w:proofErr w:type="spellStart"/>
+      <w:r>
+        <w:t>literals</w:t>
+      </w:r>
+      <w:proofErr w:type="spellEnd"/>
+      <w:r>
+        <w:t xml:space="preserve"> en lugar de concatenar </w:t>
+      </w:r>
+      <w:proofErr w:type="spellStart"/>
+      <w:r>
+        <w:t>strings</w:t>
+      </w:r>
+      <w:proofErr w:type="spellEnd"/>
+      <w:r>
+        <w:t xml:space="preserve">. </w:t>
       </w:r>
     </w:p>
     <w:p/>
@@ -575,7 +903,36 @@
         </w:numPr>
       </w:pPr>
       <w:r>
-        <w:t>Ejercicio nro 3: el método includes() te devuelve como resultado “true o false” no haría falta un if-else:</w:t>
+        <w:t xml:space="preserve">Ejercicio </w:t>
+      </w:r>
+      <w:proofErr w:type="spellStart"/>
+      <w:r>
+        <w:t>nro</w:t>
+      </w:r>
+      <w:proofErr w:type="spellEnd"/>
+      <w:r>
+        <w:t xml:space="preserve"> 3: el método </w:t>
+      </w:r>
+      <w:proofErr w:type="spellStart"/>
+      <w:proofErr w:type="gramStart"/>
+      <w:r>
+        <w:t>includes</w:t>
+      </w:r>
+      <w:proofErr w:type="spellEnd"/>
+      <w:r>
+        <w:t>(</w:t>
+      </w:r>
+      <w:proofErr w:type="gramEnd"/>
+      <w:r>
+        <w:t xml:space="preserve">) te devuelve como resultado “true o false” no haría falta un </w:t>
+      </w:r>
+      <w:proofErr w:type="spellStart"/>
+      <w:r>
+        <w:t>if-else</w:t>
+      </w:r>
+      <w:proofErr w:type="spellEnd"/>
+      <w:r>
+        <w:t>:</w:t>
       </w:r>
     </w:p>
     <w:p>
@@ -588,7 +945,17 @@
         <w:ind w:left="2124"/>
       </w:pPr>
       <w:r>
-        <w:t xml:space="preserve">console.log(nombres.includes("Camila"));   </w:t>
+        <w:t>console.log(</w:t>
+      </w:r>
+      <w:proofErr w:type="spellStart"/>
+      <w:proofErr w:type="gramStart"/>
+      <w:r>
+        <w:t>nombres.includes</w:t>
+      </w:r>
+      <w:proofErr w:type="spellEnd"/>
+      <w:proofErr w:type="gramEnd"/>
+      <w:r>
+        <w:t xml:space="preserve">("Camila"));   </w:t>
       </w:r>
     </w:p>
     <w:p>
@@ -606,7 +973,15 @@
         </w:numPr>
       </w:pPr>
       <w:r>
-        <w:t>Me hubiera gustado que utilices al operador ternario, por ejemplo, en el ejercicio nro 5:</w:t>
+        <w:t xml:space="preserve">Me hubiera gustado que utilices al operador ternario, por ejemplo, en el ejercicio </w:t>
+      </w:r>
+      <w:proofErr w:type="spellStart"/>
+      <w:r>
+        <w:t>nro</w:t>
+      </w:r>
+      <w:proofErr w:type="spellEnd"/>
+      <w:r>
+        <w:t xml:space="preserve"> 5:</w:t>
       </w:r>
       <w:r>
         <w:tab/>
@@ -617,16 +992,42 @@
       <w:pPr>
         <w:ind w:left="1416"/>
       </w:pPr>
-      <w:r>
-        <w:t>const estado = promedio &gt;= 6 ? "Aprobado" : "Reprobado";</w:t>
+      <w:proofErr w:type="spellStart"/>
+      <w:r>
+        <w:t>const</w:t>
+      </w:r>
+      <w:proofErr w:type="spellEnd"/>
+      <w:r>
+        <w:t xml:space="preserve"> estado = promedio &gt;= </w:t>
+      </w:r>
+      <w:proofErr w:type="gramStart"/>
+      <w:r>
+        <w:t>6 ?</w:t>
+      </w:r>
+      <w:proofErr w:type="gramEnd"/>
+      <w:r>
+        <w:t xml:space="preserve"> "Aprobado</w:t>
+      </w:r>
+      <w:proofErr w:type="gramStart"/>
+      <w:r>
+        <w:t>" :</w:t>
+      </w:r>
+      <w:proofErr w:type="gramEnd"/>
+      <w:r>
+        <w:t xml:space="preserve"> "Reprobado";</w:t>
       </w:r>
     </w:p>
     <w:p>
       <w:pPr>
         <w:ind w:left="1416"/>
       </w:pPr>
-      <w:r>
-        <w:t>console.log(`Estado: ${estado}`);</w:t>
+      <w:proofErr w:type="gramStart"/>
+      <w:r>
+        <w:t>console.log(</w:t>
+      </w:r>
+      <w:proofErr w:type="gramEnd"/>
+      <w:r>
+        <w:t>`Estado: ${estado}`);</w:t>
       </w:r>
     </w:p>
     <w:p>
@@ -685,7 +1086,25 @@
           <w:bCs/>
         </w:rPr>
         <w:lastRenderedPageBreak/>
-        <w:t xml:space="preserve">Figueroa Maidana Belen </w:t>
+        <w:t xml:space="preserve">Figueroa Maidana </w:t>
+      </w:r>
+      <w:proofErr w:type="spellStart"/>
+      <w:r>
+        <w:rPr>
+          <w:rFonts w:ascii="Segoe UI Emoji" w:hAnsi="Segoe UI Emoji" w:cs="Segoe UI Emoji"/>
+          <w:b/>
+          <w:bCs/>
+        </w:rPr>
+        <w:t>Belen</w:t>
+      </w:r>
+      <w:proofErr w:type="spellEnd"/>
+      <w:r>
+        <w:rPr>
+          <w:rFonts w:ascii="Segoe UI Emoji" w:hAnsi="Segoe UI Emoji" w:cs="Segoe UI Emoji"/>
+          <w:b/>
+          <w:bCs/>
+        </w:rPr>
+        <w:t xml:space="preserve"> </w:t>
       </w:r>
       <w:r>
         <w:rPr>
@@ -711,6 +1130,7 @@
           <w:rFonts w:ascii="Segoe UI Emoji" w:hAnsi="Segoe UI Emoji" w:cs="Segoe UI Emoji"/>
         </w:rPr>
       </w:pPr>
+      <w:proofErr w:type="gramStart"/>
       <w:r>
         <w:rPr>
           <w:rFonts w:ascii="Segoe UI Emoji" w:hAnsi="Segoe UI Emoji" w:cs="Segoe UI Emoji"/>
@@ -718,7 +1138,11 @@
         <w:t>🎉</w:t>
       </w:r>
       <w:r>
-        <w:t xml:space="preserve">¡Felicitaciones por la entrega del Desafío 07! </w:t>
+        <w:t>¡</w:t>
+      </w:r>
+      <w:proofErr w:type="gramEnd"/>
+      <w:r>
+        <w:t xml:space="preserve">Felicitaciones por la entrega del Desafío 07! </w:t>
       </w:r>
       <w:r>
         <w:rPr>
@@ -729,9 +1153,11 @@
     </w:p>
     <w:p/>
     <w:p>
+      <w:proofErr w:type="spellStart"/>
       <w:r>
         <w:t>Belen</w:t>
       </w:r>
+      <w:proofErr w:type="spellEnd"/>
       <w:r>
         <w:t>, excelente trabajo, te felicito por el compromiso en realizar las entregas.</w:t>
       </w:r>
@@ -739,7 +1165,31 @@
     <w:p/>
     <w:p>
       <w:r>
-        <w:t xml:space="preserve">Excelente la implementación de métodos para recorrer para arrays y objetos, diferenciaste correctamente los métodos splice y slice. </w:t>
+        <w:t xml:space="preserve">Excelente la implementación de métodos para recorrer para </w:t>
+      </w:r>
+      <w:proofErr w:type="spellStart"/>
+      <w:r>
+        <w:t>arrays</w:t>
+      </w:r>
+      <w:proofErr w:type="spellEnd"/>
+      <w:r>
+        <w:t xml:space="preserve"> y objetos, diferenciaste correctamente los métodos </w:t>
+      </w:r>
+      <w:proofErr w:type="spellStart"/>
+      <w:r>
+        <w:t>splice</w:t>
+      </w:r>
+      <w:proofErr w:type="spellEnd"/>
+      <w:r>
+        <w:t xml:space="preserve"> y </w:t>
+      </w:r>
+      <w:proofErr w:type="spellStart"/>
+      <w:r>
+        <w:t>slice</w:t>
+      </w:r>
+      <w:proofErr w:type="spellEnd"/>
+      <w:r>
+        <w:t xml:space="preserve">. </w:t>
       </w:r>
     </w:p>
     <w:p/>
@@ -751,7 +1201,47 @@
     <w:p/>
     <w:p>
       <w:r>
-        <w:t>Buenísimo que te manejaste con template literals en lugar de concatenar strings. Me hubiera gustado que utilices al operador ternario, por ejemplo en el ejercicio nro 5.</w:t>
+        <w:t xml:space="preserve">Buenísimo que te manejaste con </w:t>
+      </w:r>
+      <w:proofErr w:type="spellStart"/>
+      <w:r>
+        <w:t>template</w:t>
+      </w:r>
+      <w:proofErr w:type="spellEnd"/>
+      <w:r>
+        <w:t xml:space="preserve"> </w:t>
+      </w:r>
+      <w:proofErr w:type="spellStart"/>
+      <w:r>
+        <w:t>literals</w:t>
+      </w:r>
+      <w:proofErr w:type="spellEnd"/>
+      <w:r>
+        <w:t xml:space="preserve"> en lugar de concatenar </w:t>
+      </w:r>
+      <w:proofErr w:type="spellStart"/>
+      <w:r>
+        <w:t>strings</w:t>
+      </w:r>
+      <w:proofErr w:type="spellEnd"/>
+      <w:r>
+        <w:t xml:space="preserve">. Me hubiera gustado que utilices al operador ternario, por </w:t>
+      </w:r>
+      <w:proofErr w:type="gramStart"/>
+      <w:r>
+        <w:t>ejemplo</w:t>
+      </w:r>
+      <w:proofErr w:type="gramEnd"/>
+      <w:r>
+        <w:t xml:space="preserve"> en el ejercicio </w:t>
+      </w:r>
+      <w:proofErr w:type="spellStart"/>
+      <w:r>
+        <w:t>nro</w:t>
+      </w:r>
+      <w:proofErr w:type="spellEnd"/>
+      <w:r>
+        <w:t xml:space="preserve"> 5.</w:t>
       </w:r>
     </w:p>
     <w:p/>
@@ -810,24 +1300,61 @@
           <w:b/>
           <w:bCs/>
         </w:rPr>
-        <w:t>Segovia Rodriguez Estefani Lujan</w:t>
-      </w:r>
-    </w:p>
-    <w:p>
-      <w:pPr>
-        <w:rPr>
-          <w:rFonts w:ascii="Segoe UI Emoji" w:hAnsi="Segoe UI Emoji" w:cs="Segoe UI Emoji"/>
-          <w:b/>
-          <w:bCs/>
-        </w:rPr>
-      </w:pPr>
-    </w:p>
-    <w:p>
-      <w:pPr>
-        <w:rPr>
-          <w:rFonts w:ascii="Segoe UI Emoji" w:hAnsi="Segoe UI Emoji" w:cs="Segoe UI Emoji"/>
-        </w:rPr>
-      </w:pPr>
+        <w:t xml:space="preserve">Segovia </w:t>
+      </w:r>
+      <w:proofErr w:type="spellStart"/>
+      <w:r>
+        <w:rPr>
+          <w:rFonts w:ascii="Segoe UI Emoji" w:hAnsi="Segoe UI Emoji" w:cs="Segoe UI Emoji"/>
+          <w:b/>
+          <w:bCs/>
+        </w:rPr>
+        <w:t>Rodriguez</w:t>
+      </w:r>
+      <w:proofErr w:type="spellEnd"/>
+      <w:r>
+        <w:rPr>
+          <w:rFonts w:ascii="Segoe UI Emoji" w:hAnsi="Segoe UI Emoji" w:cs="Segoe UI Emoji"/>
+          <w:b/>
+          <w:bCs/>
+        </w:rPr>
+        <w:t xml:space="preserve"> </w:t>
+      </w:r>
+      <w:proofErr w:type="spellStart"/>
+      <w:r>
+        <w:rPr>
+          <w:rFonts w:ascii="Segoe UI Emoji" w:hAnsi="Segoe UI Emoji" w:cs="Segoe UI Emoji"/>
+          <w:b/>
+          <w:bCs/>
+        </w:rPr>
+        <w:t>Estefani</w:t>
+      </w:r>
+      <w:proofErr w:type="spellEnd"/>
+      <w:r>
+        <w:rPr>
+          <w:rFonts w:ascii="Segoe UI Emoji" w:hAnsi="Segoe UI Emoji" w:cs="Segoe UI Emoji"/>
+          <w:b/>
+          <w:bCs/>
+        </w:rPr>
+        <w:t xml:space="preserve"> Lujan</w:t>
+      </w:r>
+    </w:p>
+    <w:p>
+      <w:pPr>
+        <w:rPr>
+          <w:rFonts w:ascii="Segoe UI Emoji" w:hAnsi="Segoe UI Emoji" w:cs="Segoe UI Emoji"/>
+          <w:b/>
+          <w:bCs/>
+        </w:rPr>
+      </w:pPr>
+    </w:p>
+    <w:p>
+      <w:pPr>
+        <w:rPr>
+          <w:rFonts w:ascii="Segoe UI Emoji" w:hAnsi="Segoe UI Emoji" w:cs="Segoe UI Emoji"/>
+        </w:rPr>
+      </w:pPr>
+      <w:proofErr w:type="gramStart"/>
       <w:r>
         <w:rPr>
           <w:rFonts w:ascii="Segoe UI Emoji" w:hAnsi="Segoe UI Emoji" w:cs="Segoe UI Emoji"/>
@@ -835,7 +1362,11 @@
         <w:t>🎉</w:t>
       </w:r>
       <w:r>
-        <w:t xml:space="preserve">¡Felicitaciones por la entrega del Desafío 07! </w:t>
+        <w:t>¡</w:t>
+      </w:r>
+      <w:proofErr w:type="gramEnd"/>
+      <w:r>
+        <w:t xml:space="preserve">Felicitaciones por la entrega del Desafío 07! </w:t>
       </w:r>
       <w:r>
         <w:rPr>
@@ -846,14 +1377,43 @@
     </w:p>
     <w:p/>
     <w:p>
-      <w:r>
-        <w:t>Estefani, excelente trabajo, te felicito por el compromiso en realizar las entregas.</w:t>
-      </w:r>
-    </w:p>
-    <w:p/>
-    <w:p>
-      <w:r>
-        <w:t xml:space="preserve">Excelente la implementación de métodos para recorrer para arrays y objetos, diferenciaste correctamente los métodos splice y slice. </w:t>
+      <w:proofErr w:type="spellStart"/>
+      <w:r>
+        <w:t>Estefani</w:t>
+      </w:r>
+      <w:proofErr w:type="spellEnd"/>
+      <w:r>
+        <w:t>, excelente trabajo, te felicito por el compromiso en realizar las entregas.</w:t>
+      </w:r>
+    </w:p>
+    <w:p/>
+    <w:p>
+      <w:r>
+        <w:t xml:space="preserve">Excelente la implementación de métodos para recorrer para </w:t>
+      </w:r>
+      <w:proofErr w:type="spellStart"/>
+      <w:r>
+        <w:t>arrays</w:t>
+      </w:r>
+      <w:proofErr w:type="spellEnd"/>
+      <w:r>
+        <w:t xml:space="preserve"> y objetos, diferenciaste correctamente los métodos </w:t>
+      </w:r>
+      <w:proofErr w:type="spellStart"/>
+      <w:r>
+        <w:t>splice</w:t>
+      </w:r>
+      <w:proofErr w:type="spellEnd"/>
+      <w:r>
+        <w:t xml:space="preserve"> y </w:t>
+      </w:r>
+      <w:proofErr w:type="spellStart"/>
+      <w:r>
+        <w:t>slice</w:t>
+      </w:r>
+      <w:proofErr w:type="spellEnd"/>
+      <w:r>
+        <w:t xml:space="preserve">. </w:t>
       </w:r>
     </w:p>
     <w:p/>
@@ -865,7 +1425,31 @@
     <w:p/>
     <w:p>
       <w:r>
-        <w:t>Buenísimo que te manejaste con template literals en lugar de concatenar strings y que utilizaste condicionales ternarios.</w:t>
+        <w:t xml:space="preserve">Buenísimo que te manejaste con </w:t>
+      </w:r>
+      <w:proofErr w:type="spellStart"/>
+      <w:r>
+        <w:t>template</w:t>
+      </w:r>
+      <w:proofErr w:type="spellEnd"/>
+      <w:r>
+        <w:t xml:space="preserve"> </w:t>
+      </w:r>
+      <w:proofErr w:type="spellStart"/>
+      <w:r>
+        <w:t>literals</w:t>
+      </w:r>
+      <w:proofErr w:type="spellEnd"/>
+      <w:r>
+        <w:t xml:space="preserve"> en lugar de concatenar </w:t>
+      </w:r>
+      <w:proofErr w:type="spellStart"/>
+      <w:r>
+        <w:t>strings</w:t>
+      </w:r>
+      <w:proofErr w:type="spellEnd"/>
+      <w:r>
+        <w:t xml:space="preserve"> y que utilizaste condicionales ternarios.</w:t>
       </w:r>
     </w:p>
     <w:p/>
@@ -937,6 +1521,7 @@
           <w:rFonts w:ascii="Segoe UI Emoji" w:hAnsi="Segoe UI Emoji" w:cs="Segoe UI Emoji"/>
         </w:rPr>
       </w:pPr>
+      <w:proofErr w:type="gramStart"/>
       <w:r>
         <w:rPr>
           <w:rFonts w:ascii="Segoe UI Emoji" w:hAnsi="Segoe UI Emoji" w:cs="Segoe UI Emoji"/>
@@ -944,7 +1529,11 @@
         <w:t>🎉</w:t>
       </w:r>
       <w:r>
-        <w:t xml:space="preserve">¡Felicitaciones por la entrega del Desafío 06! </w:t>
+        <w:t>¡</w:t>
+      </w:r>
+      <w:proofErr w:type="gramEnd"/>
+      <w:r>
+        <w:t xml:space="preserve">Felicitaciones por la entrega del Desafío 06! </w:t>
       </w:r>
       <w:r>
         <w:rPr>
@@ -962,7 +1551,55 @@
     <w:p/>
     <w:p>
       <w:r>
-        <w:t>Correcta la implementación de estructuras condicionales “if”, “else if”, “else” con multiples ramas asi como “switch/case”.</w:t>
+        <w:t>Correcta la implementación de estructuras condicionales “</w:t>
+      </w:r>
+      <w:proofErr w:type="spellStart"/>
+      <w:r>
+        <w:t>if</w:t>
+      </w:r>
+      <w:proofErr w:type="spellEnd"/>
+      <w:r>
+        <w:t>”, “</w:t>
+      </w:r>
+      <w:proofErr w:type="spellStart"/>
+      <w:r>
+        <w:t>else</w:t>
+      </w:r>
+      <w:proofErr w:type="spellEnd"/>
+      <w:r>
+        <w:t xml:space="preserve"> </w:t>
+      </w:r>
+      <w:proofErr w:type="spellStart"/>
+      <w:r>
+        <w:t>if</w:t>
+      </w:r>
+      <w:proofErr w:type="spellEnd"/>
+      <w:r>
+        <w:t>”, “</w:t>
+      </w:r>
+      <w:proofErr w:type="spellStart"/>
+      <w:r>
+        <w:t>else</w:t>
+      </w:r>
+      <w:proofErr w:type="spellEnd"/>
+      <w:r>
+        <w:t xml:space="preserve">” con </w:t>
+      </w:r>
+      <w:proofErr w:type="spellStart"/>
+      <w:r>
+        <w:t>multiples</w:t>
+      </w:r>
+      <w:proofErr w:type="spellEnd"/>
+      <w:r>
+        <w:t xml:space="preserve"> ramas </w:t>
+      </w:r>
+      <w:proofErr w:type="spellStart"/>
+      <w:r>
+        <w:t>asi</w:t>
+      </w:r>
+      <w:proofErr w:type="spellEnd"/>
+      <w:r>
+        <w:t xml:space="preserve"> como “switch/case”.</w:t>
       </w:r>
     </w:p>
     <w:p/>
@@ -974,7 +1611,31 @@
     <w:p/>
     <w:p>
       <w:r>
-        <w:t>Buenísimo que te manejaste con template literals en lugar de concatenar strings.</w:t>
+        <w:t xml:space="preserve">Buenísimo que te manejaste con </w:t>
+      </w:r>
+      <w:proofErr w:type="spellStart"/>
+      <w:r>
+        <w:t>template</w:t>
+      </w:r>
+      <w:proofErr w:type="spellEnd"/>
+      <w:r>
+        <w:t xml:space="preserve"> </w:t>
+      </w:r>
+      <w:proofErr w:type="spellStart"/>
+      <w:r>
+        <w:t>literals</w:t>
+      </w:r>
+      <w:proofErr w:type="spellEnd"/>
+      <w:r>
+        <w:t xml:space="preserve"> en lugar de concatenar </w:t>
+      </w:r>
+      <w:proofErr w:type="spellStart"/>
+      <w:r>
+        <w:t>strings</w:t>
+      </w:r>
+      <w:proofErr w:type="spellEnd"/>
+      <w:r>
+        <w:t>.</w:t>
       </w:r>
     </w:p>
     <w:p/>
@@ -1018,8 +1679,34 @@
       <w:pPr>
         <w:ind w:left="2124"/>
       </w:pPr>
-      <w:r>
-        <w:t>let mensaje = formularioValido ? "Valido" : "invalido";</w:t>
+      <w:proofErr w:type="spellStart"/>
+      <w:r>
+        <w:t>let</w:t>
+      </w:r>
+      <w:proofErr w:type="spellEnd"/>
+      <w:r>
+        <w:t xml:space="preserve"> mensaje = </w:t>
+      </w:r>
+      <w:proofErr w:type="spellStart"/>
+      <w:proofErr w:type="gramStart"/>
+      <w:r>
+        <w:t>formularioValido</w:t>
+      </w:r>
+      <w:proofErr w:type="spellEnd"/>
+      <w:r>
+        <w:t xml:space="preserve"> ?</w:t>
+      </w:r>
+      <w:proofErr w:type="gramEnd"/>
+      <w:r>
+        <w:t xml:space="preserve"> "Valido</w:t>
+      </w:r>
+      <w:proofErr w:type="gramStart"/>
+      <w:r>
+        <w:t>" :</w:t>
+      </w:r>
+      <w:proofErr w:type="gramEnd"/>
+      <w:r>
+        <w:t xml:space="preserve"> "invalido";</w:t>
       </w:r>
     </w:p>
     <w:p>
@@ -1072,30 +1759,41 @@
           <w:bCs/>
         </w:rPr>
       </w:pPr>
-      <w:r>
-        <w:rPr>
-          <w:rFonts w:ascii="Segoe UI Emoji" w:hAnsi="Segoe UI Emoji" w:cs="Segoe UI Emoji"/>
-          <w:b/>
-          <w:bCs/>
-        </w:rPr>
-        <w:t>Chiapello Gianluca</w:t>
-      </w:r>
-    </w:p>
-    <w:p>
-      <w:pPr>
-        <w:rPr>
-          <w:rFonts w:ascii="Segoe UI Emoji" w:hAnsi="Segoe UI Emoji" w:cs="Segoe UI Emoji"/>
-          <w:b/>
-          <w:bCs/>
-        </w:rPr>
-      </w:pPr>
-    </w:p>
-    <w:p>
-      <w:pPr>
-        <w:rPr>
-          <w:rFonts w:ascii="Segoe UI Emoji" w:hAnsi="Segoe UI Emoji" w:cs="Segoe UI Emoji"/>
-        </w:rPr>
-      </w:pPr>
+      <w:proofErr w:type="spellStart"/>
+      <w:r>
+        <w:rPr>
+          <w:rFonts w:ascii="Segoe UI Emoji" w:hAnsi="Segoe UI Emoji" w:cs="Segoe UI Emoji"/>
+          <w:b/>
+          <w:bCs/>
+        </w:rPr>
+        <w:t>Chiapello</w:t>
+      </w:r>
+      <w:proofErr w:type="spellEnd"/>
+      <w:r>
+        <w:rPr>
+          <w:rFonts w:ascii="Segoe UI Emoji" w:hAnsi="Segoe UI Emoji" w:cs="Segoe UI Emoji"/>
+          <w:b/>
+          <w:bCs/>
+        </w:rPr>
+        <w:t xml:space="preserve"> Gianluca</w:t>
+      </w:r>
+    </w:p>
+    <w:p>
+      <w:pPr>
+        <w:rPr>
+          <w:rFonts w:ascii="Segoe UI Emoji" w:hAnsi="Segoe UI Emoji" w:cs="Segoe UI Emoji"/>
+          <w:b/>
+          <w:bCs/>
+        </w:rPr>
+      </w:pPr>
+    </w:p>
+    <w:p>
+      <w:pPr>
+        <w:rPr>
+          <w:rFonts w:ascii="Segoe UI Emoji" w:hAnsi="Segoe UI Emoji" w:cs="Segoe UI Emoji"/>
+        </w:rPr>
+      </w:pPr>
+      <w:proofErr w:type="gramStart"/>
       <w:r>
         <w:rPr>
           <w:rFonts w:ascii="Segoe UI Emoji" w:hAnsi="Segoe UI Emoji" w:cs="Segoe UI Emoji"/>
@@ -1103,7 +1801,11 @@
         <w:t>🎉</w:t>
       </w:r>
       <w:r>
-        <w:t xml:space="preserve">¡Felicitaciones por la entrega del Desafío 07! </w:t>
+        <w:t>¡</w:t>
+      </w:r>
+      <w:proofErr w:type="gramEnd"/>
+      <w:r>
+        <w:t xml:space="preserve">Felicitaciones por la entrega del Desafío 07! </w:t>
       </w:r>
       <w:r>
         <w:rPr>
@@ -1115,16 +1817,37 @@
     <w:p/>
     <w:p>
       <w:r>
-        <w:t>Gianluca</w:t>
-      </w:r>
-      <w:r>
-        <w:t>, excelente trabajo, te felicito por el compromiso en realizar las entregas.</w:t>
-      </w:r>
-    </w:p>
-    <w:p/>
-    <w:p>
-      <w:r>
-        <w:t xml:space="preserve">Excelente la implementación de métodos para recorrer para arrays y objetos, diferenciaste correctamente los métodos splice y slice. </w:t>
+        <w:t>Gianluca, excelente trabajo, te felicito por el compromiso en realizar las entregas.</w:t>
+      </w:r>
+    </w:p>
+    <w:p/>
+    <w:p>
+      <w:r>
+        <w:t xml:space="preserve">Excelente la implementación de métodos para recorrer para </w:t>
+      </w:r>
+      <w:proofErr w:type="spellStart"/>
+      <w:r>
+        <w:t>arrays</w:t>
+      </w:r>
+      <w:proofErr w:type="spellEnd"/>
+      <w:r>
+        <w:t xml:space="preserve"> y objetos, diferenciaste correctamente los métodos </w:t>
+      </w:r>
+      <w:proofErr w:type="spellStart"/>
+      <w:r>
+        <w:t>splice</w:t>
+      </w:r>
+      <w:proofErr w:type="spellEnd"/>
+      <w:r>
+        <w:t xml:space="preserve"> y </w:t>
+      </w:r>
+      <w:proofErr w:type="spellStart"/>
+      <w:r>
+        <w:t>slice</w:t>
+      </w:r>
+      <w:proofErr w:type="spellEnd"/>
+      <w:r>
+        <w:t xml:space="preserve">. </w:t>
       </w:r>
     </w:p>
     <w:p/>
@@ -1137,7 +1860,31 @@
     <w:p>
       <w:r>
         <w:lastRenderedPageBreak/>
-        <w:t xml:space="preserve">Buenísimo que te manejaste con template literals en lugar de concatenar strings. </w:t>
+        <w:t xml:space="preserve">Buenísimo que te manejaste con </w:t>
+      </w:r>
+      <w:proofErr w:type="spellStart"/>
+      <w:r>
+        <w:t>template</w:t>
+      </w:r>
+      <w:proofErr w:type="spellEnd"/>
+      <w:r>
+        <w:t xml:space="preserve"> </w:t>
+      </w:r>
+      <w:proofErr w:type="spellStart"/>
+      <w:r>
+        <w:t>literals</w:t>
+      </w:r>
+      <w:proofErr w:type="spellEnd"/>
+      <w:r>
+        <w:t xml:space="preserve"> en lugar de concatenar </w:t>
+      </w:r>
+      <w:proofErr w:type="spellStart"/>
+      <w:r>
+        <w:t>strings</w:t>
+      </w:r>
+      <w:proofErr w:type="spellEnd"/>
+      <w:r>
+        <w:t xml:space="preserve">. </w:t>
       </w:r>
     </w:p>
     <w:p/>
@@ -1153,6 +1900,7 @@
         <w:t>Observaciones a tu trabajo son:</w:t>
       </w:r>
     </w:p>
+    <w:p/>
     <w:p/>
     <w:p>
       <w:pPr>
@@ -1169,7 +1917,15 @@
         <w:t>ejemplo,</w:t>
       </w:r>
       <w:r>
-        <w:t xml:space="preserve"> en el ejercicio nro 5:</w:t>
+        <w:t xml:space="preserve"> en el ejercicio </w:t>
+      </w:r>
+      <w:proofErr w:type="spellStart"/>
+      <w:r>
+        <w:t>nro</w:t>
+      </w:r>
+      <w:proofErr w:type="spellEnd"/>
+      <w:r>
+        <w:t xml:space="preserve"> 5:</w:t>
       </w:r>
       <w:r>
         <w:tab/>
@@ -1180,16 +1936,42 @@
       <w:pPr>
         <w:ind w:left="1416"/>
       </w:pPr>
-      <w:r>
-        <w:t>const estado = promedio &gt;= 6 ? "Aprobado" : "Reprobado";</w:t>
+      <w:proofErr w:type="spellStart"/>
+      <w:r>
+        <w:t>const</w:t>
+      </w:r>
+      <w:proofErr w:type="spellEnd"/>
+      <w:r>
+        <w:t xml:space="preserve"> estado = promedio &gt;= </w:t>
+      </w:r>
+      <w:proofErr w:type="gramStart"/>
+      <w:r>
+        <w:t>6 ?</w:t>
+      </w:r>
+      <w:proofErr w:type="gramEnd"/>
+      <w:r>
+        <w:t xml:space="preserve"> "Aprobado</w:t>
+      </w:r>
+      <w:proofErr w:type="gramStart"/>
+      <w:r>
+        <w:t>" :</w:t>
+      </w:r>
+      <w:proofErr w:type="gramEnd"/>
+      <w:r>
+        <w:t xml:space="preserve"> "Reprobado";</w:t>
       </w:r>
     </w:p>
     <w:p>
       <w:pPr>
         <w:ind w:left="1416"/>
       </w:pPr>
-      <w:r>
-        <w:t>console.log(`Estado: ${estado}`);</w:t>
+      <w:proofErr w:type="gramStart"/>
+      <w:r>
+        <w:t>console.log(</w:t>
+      </w:r>
+      <w:proofErr w:type="gramEnd"/>
+      <w:r>
+        <w:t>`Estado: ${estado}`);</w:t>
       </w:r>
     </w:p>
     <w:p>
@@ -1212,7 +1994,31 @@
         </w:numPr>
       </w:pPr>
       <w:r>
-        <w:t>En el Ejercicio nro 10 podes realizar la sumatoria de notas en el primer bucle for junto con el console.log() :</w:t>
+        <w:t xml:space="preserve">En el Ejercicio </w:t>
+      </w:r>
+      <w:proofErr w:type="spellStart"/>
+      <w:r>
+        <w:t>nro</w:t>
+      </w:r>
+      <w:proofErr w:type="spellEnd"/>
+      <w:r>
+        <w:t xml:space="preserve"> 10 podes realizar la sumatoria de notas en el primer bucle </w:t>
+      </w:r>
+      <w:proofErr w:type="spellStart"/>
+      <w:r>
+        <w:t>for</w:t>
+      </w:r>
+      <w:proofErr w:type="spellEnd"/>
+      <w:r>
+        <w:t xml:space="preserve"> junto con el </w:t>
+      </w:r>
+      <w:proofErr w:type="gramStart"/>
+      <w:r>
+        <w:t>console.log(</w:t>
+      </w:r>
+      <w:proofErr w:type="gramEnd"/>
+      <w:r>
+        <w:t>) :</w:t>
       </w:r>
     </w:p>
     <w:p>
@@ -1227,11 +2033,47 @@
           <w:lang w:val="en-US"/>
         </w:rPr>
       </w:pPr>
+      <w:proofErr w:type="gramStart"/>
       <w:r>
         <w:rPr>
           <w:lang w:val="en-US"/>
         </w:rPr>
-        <w:t>for(let materia in calificaciones){</w:t>
+        <w:t>for(</w:t>
+      </w:r>
+      <w:proofErr w:type="gramEnd"/>
+      <w:r>
+        <w:rPr>
+          <w:lang w:val="en-US"/>
+        </w:rPr>
+        <w:t xml:space="preserve">let </w:t>
+      </w:r>
+      <w:proofErr w:type="spellStart"/>
+      <w:r>
+        <w:rPr>
+          <w:lang w:val="en-US"/>
+        </w:rPr>
+        <w:t>materia</w:t>
+      </w:r>
+      <w:proofErr w:type="spellEnd"/>
+      <w:r>
+        <w:rPr>
+          <w:lang w:val="en-US"/>
+        </w:rPr>
+        <w:t xml:space="preserve"> in </w:t>
+      </w:r>
+      <w:proofErr w:type="spellStart"/>
+      <w:r>
+        <w:rPr>
+          <w:lang w:val="en-US"/>
+        </w:rPr>
+        <w:t>calificaciones</w:t>
+      </w:r>
+      <w:proofErr w:type="spellEnd"/>
+      <w:r>
+        <w:rPr>
+          <w:lang w:val="en-US"/>
+        </w:rPr>
+        <w:t>){</w:t>
       </w:r>
     </w:p>
     <w:p>
@@ -1244,8 +2086,13 @@
         </w:rPr>
         <w:t xml:space="preserve">    </w:t>
       </w:r>
-      <w:r>
-        <w:t>console.log(materia, ":", calificaciones[materia]);</w:t>
+      <w:proofErr w:type="gramStart"/>
+      <w:r>
+        <w:t>console.log(</w:t>
+      </w:r>
+      <w:proofErr w:type="gramEnd"/>
+      <w:r>
+        <w:t>materia, ":", calificaciones[materia]);</w:t>
       </w:r>
     </w:p>
     <w:p>
@@ -1335,6 +2182,7 @@
           <w:rFonts w:ascii="Segoe UI Emoji" w:hAnsi="Segoe UI Emoji" w:cs="Segoe UI Emoji"/>
         </w:rPr>
       </w:pPr>
+      <w:proofErr w:type="gramStart"/>
       <w:r>
         <w:rPr>
           <w:rFonts w:ascii="Segoe UI Emoji" w:hAnsi="Segoe UI Emoji" w:cs="Segoe UI Emoji"/>
@@ -1342,7 +2190,11 @@
         <w:t>🎉</w:t>
       </w:r>
       <w:r>
-        <w:t xml:space="preserve">¡Felicitaciones por la entrega del Desafío 07! </w:t>
+        <w:t>¡</w:t>
+      </w:r>
+      <w:proofErr w:type="gramEnd"/>
+      <w:r>
+        <w:t xml:space="preserve">Felicitaciones por la entrega del Desafío 07! </w:t>
       </w:r>
       <w:r>
         <w:rPr>
@@ -1360,7 +2212,31 @@
     <w:p/>
     <w:p>
       <w:r>
-        <w:t xml:space="preserve">Excelente la implementación de métodos para recorrer para arrays y objetos, diferenciaste correctamente los métodos splice y slice. </w:t>
+        <w:t xml:space="preserve">Excelente la implementación de métodos para recorrer para </w:t>
+      </w:r>
+      <w:proofErr w:type="spellStart"/>
+      <w:r>
+        <w:t>arrays</w:t>
+      </w:r>
+      <w:proofErr w:type="spellEnd"/>
+      <w:r>
+        <w:t xml:space="preserve"> y objetos, diferenciaste correctamente los métodos </w:t>
+      </w:r>
+      <w:proofErr w:type="spellStart"/>
+      <w:r>
+        <w:t>splice</w:t>
+      </w:r>
+      <w:proofErr w:type="spellEnd"/>
+      <w:r>
+        <w:t xml:space="preserve"> y </w:t>
+      </w:r>
+      <w:proofErr w:type="spellStart"/>
+      <w:r>
+        <w:t>slice</w:t>
+      </w:r>
+      <w:proofErr w:type="spellEnd"/>
+      <w:r>
+        <w:t xml:space="preserve">. </w:t>
       </w:r>
     </w:p>
     <w:p/>
@@ -1372,7 +2248,31 @@
     <w:p/>
     <w:p>
       <w:r>
-        <w:t>Buenísimo que te manejaste con template literals en lugar de concatenar strings y que utilizaste condicionales ternarios.</w:t>
+        <w:t xml:space="preserve">Buenísimo que te manejaste con </w:t>
+      </w:r>
+      <w:proofErr w:type="spellStart"/>
+      <w:r>
+        <w:t>template</w:t>
+      </w:r>
+      <w:proofErr w:type="spellEnd"/>
+      <w:r>
+        <w:t xml:space="preserve"> </w:t>
+      </w:r>
+      <w:proofErr w:type="spellStart"/>
+      <w:r>
+        <w:t>literals</w:t>
+      </w:r>
+      <w:proofErr w:type="spellEnd"/>
+      <w:r>
+        <w:t xml:space="preserve"> en lugar de concatenar </w:t>
+      </w:r>
+      <w:proofErr w:type="spellStart"/>
+      <w:r>
+        <w:t>strings</w:t>
+      </w:r>
+      <w:proofErr w:type="spellEnd"/>
+      <w:r>
+        <w:t xml:space="preserve"> y que utilizaste condicionales ternarios.</w:t>
       </w:r>
     </w:p>
     <w:p/>
@@ -1418,30 +2318,51 @@
           <w:bCs/>
         </w:rPr>
       </w:pPr>
-      <w:r>
-        <w:rPr>
-          <w:rFonts w:ascii="Segoe UI Emoji" w:hAnsi="Segoe UI Emoji" w:cs="Segoe UI Emoji"/>
-          <w:b/>
-          <w:bCs/>
-        </w:rPr>
-        <w:t>Vernengo Hipolito</w:t>
-      </w:r>
-    </w:p>
-    <w:p>
-      <w:pPr>
-        <w:rPr>
-          <w:rFonts w:ascii="Segoe UI Emoji" w:hAnsi="Segoe UI Emoji" w:cs="Segoe UI Emoji"/>
-          <w:b/>
-          <w:bCs/>
-        </w:rPr>
-      </w:pPr>
-    </w:p>
-    <w:p>
-      <w:pPr>
-        <w:rPr>
-          <w:rFonts w:ascii="Segoe UI Emoji" w:hAnsi="Segoe UI Emoji" w:cs="Segoe UI Emoji"/>
-        </w:rPr>
-      </w:pPr>
+      <w:proofErr w:type="spellStart"/>
+      <w:r>
+        <w:rPr>
+          <w:rFonts w:ascii="Segoe UI Emoji" w:hAnsi="Segoe UI Emoji" w:cs="Segoe UI Emoji"/>
+          <w:b/>
+          <w:bCs/>
+        </w:rPr>
+        <w:t>Vernengo</w:t>
+      </w:r>
+      <w:proofErr w:type="spellEnd"/>
+      <w:r>
+        <w:rPr>
+          <w:rFonts w:ascii="Segoe UI Emoji" w:hAnsi="Segoe UI Emoji" w:cs="Segoe UI Emoji"/>
+          <w:b/>
+          <w:bCs/>
+        </w:rPr>
+        <w:t xml:space="preserve"> </w:t>
+      </w:r>
+      <w:proofErr w:type="spellStart"/>
+      <w:r>
+        <w:rPr>
+          <w:rFonts w:ascii="Segoe UI Emoji" w:hAnsi="Segoe UI Emoji" w:cs="Segoe UI Emoji"/>
+          <w:b/>
+          <w:bCs/>
+        </w:rPr>
+        <w:t>Hipolito</w:t>
+      </w:r>
+      <w:proofErr w:type="spellEnd"/>
+    </w:p>
+    <w:p>
+      <w:pPr>
+        <w:rPr>
+          <w:rFonts w:ascii="Segoe UI Emoji" w:hAnsi="Segoe UI Emoji" w:cs="Segoe UI Emoji"/>
+          <w:b/>
+          <w:bCs/>
+        </w:rPr>
+      </w:pPr>
+    </w:p>
+    <w:p>
+      <w:pPr>
+        <w:rPr>
+          <w:rFonts w:ascii="Segoe UI Emoji" w:hAnsi="Segoe UI Emoji" w:cs="Segoe UI Emoji"/>
+        </w:rPr>
+      </w:pPr>
+      <w:proofErr w:type="gramStart"/>
       <w:r>
         <w:rPr>
           <w:rFonts w:ascii="Segoe UI Emoji" w:hAnsi="Segoe UI Emoji" w:cs="Segoe UI Emoji"/>
@@ -1449,7 +2370,11 @@
         <w:t>🎉</w:t>
       </w:r>
       <w:r>
-        <w:t xml:space="preserve">¡Felicitaciones por la entrega del Desafío 07! </w:t>
+        <w:t>¡</w:t>
+      </w:r>
+      <w:proofErr w:type="gramEnd"/>
+      <w:r>
+        <w:t xml:space="preserve">Felicitaciones por la entrega del Desafío 07! </w:t>
       </w:r>
       <w:r>
         <w:rPr>
@@ -1460,9 +2385,11 @@
     </w:p>
     <w:p/>
     <w:p>
+      <w:proofErr w:type="spellStart"/>
       <w:r>
         <w:t>Hipolito</w:t>
       </w:r>
+      <w:proofErr w:type="spellEnd"/>
       <w:r>
         <w:t>, excelente trabajo, te felicito por el compromiso en realizar las entregas.</w:t>
       </w:r>
@@ -1470,8 +2397,31 @@
     <w:p/>
     <w:p>
       <w:r>
-        <w:lastRenderedPageBreak/>
-        <w:t xml:space="preserve">Excelente la implementación de métodos para recorrer para arrays y objetos, diferenciaste correctamente los métodos splice y slice. </w:t>
+        <w:t xml:space="preserve">Excelente la implementación de métodos para recorrer para </w:t>
+      </w:r>
+      <w:proofErr w:type="spellStart"/>
+      <w:r>
+        <w:t>arrays</w:t>
+      </w:r>
+      <w:proofErr w:type="spellEnd"/>
+      <w:r>
+        <w:t xml:space="preserve"> y objetos, diferenciaste correctamente los métodos </w:t>
+      </w:r>
+      <w:proofErr w:type="spellStart"/>
+      <w:r>
+        <w:t>splice</w:t>
+      </w:r>
+      <w:proofErr w:type="spellEnd"/>
+      <w:r>
+        <w:t xml:space="preserve"> y </w:t>
+      </w:r>
+      <w:proofErr w:type="spellStart"/>
+      <w:r>
+        <w:t>slice</w:t>
+      </w:r>
+      <w:proofErr w:type="spellEnd"/>
+      <w:r>
+        <w:t xml:space="preserve">. </w:t>
       </w:r>
     </w:p>
     <w:p/>
@@ -1483,7 +2433,31 @@
     <w:p/>
     <w:p>
       <w:r>
-        <w:t xml:space="preserve">Buenísimo que te manejaste con template literals en lugar de concatenar strings. </w:t>
+        <w:t xml:space="preserve">Buenísimo que te manejaste con </w:t>
+      </w:r>
+      <w:proofErr w:type="spellStart"/>
+      <w:r>
+        <w:t>template</w:t>
+      </w:r>
+      <w:proofErr w:type="spellEnd"/>
+      <w:r>
+        <w:t xml:space="preserve"> </w:t>
+      </w:r>
+      <w:proofErr w:type="spellStart"/>
+      <w:r>
+        <w:t>literals</w:t>
+      </w:r>
+      <w:proofErr w:type="spellEnd"/>
+      <w:r>
+        <w:t xml:space="preserve"> en lugar de concatenar </w:t>
+      </w:r>
+      <w:proofErr w:type="spellStart"/>
+      <w:r>
+        <w:t>strings</w:t>
+      </w:r>
+      <w:proofErr w:type="spellEnd"/>
+      <w:r>
+        <w:t xml:space="preserve">. </w:t>
       </w:r>
     </w:p>
     <w:p/>
@@ -1509,7 +2483,23 @@
         </w:numPr>
       </w:pPr>
       <w:r>
-        <w:t>Me hubiera gustado que utilices al operador ternario, por ejemplo en el ejercicio nro 5</w:t>
+        <w:t xml:space="preserve">Me hubiera gustado que utilices al operador ternario, por </w:t>
+      </w:r>
+      <w:proofErr w:type="gramStart"/>
+      <w:r>
+        <w:t>ejemplo</w:t>
+      </w:r>
+      <w:proofErr w:type="gramEnd"/>
+      <w:r>
+        <w:t xml:space="preserve"> en el ejercicio </w:t>
+      </w:r>
+      <w:proofErr w:type="spellStart"/>
+      <w:r>
+        <w:t>nro</w:t>
+      </w:r>
+      <w:proofErr w:type="spellEnd"/>
+      <w:r>
+        <w:t xml:space="preserve"> 5</w:t>
       </w:r>
       <w:r>
         <w:t>:</w:t>
@@ -1523,16 +2513,42 @@
       <w:pPr>
         <w:ind w:left="1416"/>
       </w:pPr>
-      <w:r>
-        <w:t>const estado = promedio &gt;= 6 ? "Aprobado" : "Reprobado";</w:t>
+      <w:proofErr w:type="spellStart"/>
+      <w:r>
+        <w:t>const</w:t>
+      </w:r>
+      <w:proofErr w:type="spellEnd"/>
+      <w:r>
+        <w:t xml:space="preserve"> estado = promedio &gt;= </w:t>
+      </w:r>
+      <w:proofErr w:type="gramStart"/>
+      <w:r>
+        <w:t>6 ?</w:t>
+      </w:r>
+      <w:proofErr w:type="gramEnd"/>
+      <w:r>
+        <w:t xml:space="preserve"> "Aprobado</w:t>
+      </w:r>
+      <w:proofErr w:type="gramStart"/>
+      <w:r>
+        <w:t>" :</w:t>
+      </w:r>
+      <w:proofErr w:type="gramEnd"/>
+      <w:r>
+        <w:t xml:space="preserve"> "Reprobado";</w:t>
       </w:r>
     </w:p>
     <w:p>
       <w:pPr>
         <w:ind w:left="1416"/>
       </w:pPr>
-      <w:r>
-        <w:t>console.log(`Estado: ${estado}`);</w:t>
+      <w:proofErr w:type="gramStart"/>
+      <w:r>
+        <w:t>console.log(</w:t>
+      </w:r>
+      <w:proofErr w:type="gramEnd"/>
+      <w:r>
+        <w:t>`Estado: ${estado}`);</w:t>
       </w:r>
     </w:p>
     <w:p>
@@ -1555,10 +2571,34 @@
         </w:numPr>
       </w:pPr>
       <w:r>
-        <w:t>En el Ejercicio nro 1</w:t>
-      </w:r>
-      <w:r>
-        <w:t>0 podes realizar la sumatoria de notas en el primer bucle for junto con el console.log() :</w:t>
+        <w:t xml:space="preserve">En el Ejercicio </w:t>
+      </w:r>
+      <w:proofErr w:type="spellStart"/>
+      <w:r>
+        <w:t>nro</w:t>
+      </w:r>
+      <w:proofErr w:type="spellEnd"/>
+      <w:r>
+        <w:t xml:space="preserve"> 1</w:t>
+      </w:r>
+      <w:r>
+        <w:t xml:space="preserve">0 podes realizar la sumatoria de notas en el primer bucle </w:t>
+      </w:r>
+      <w:proofErr w:type="spellStart"/>
+      <w:r>
+        <w:t>for</w:t>
+      </w:r>
+      <w:proofErr w:type="spellEnd"/>
+      <w:r>
+        <w:t xml:space="preserve"> junto con el </w:t>
+      </w:r>
+      <w:proofErr w:type="gramStart"/>
+      <w:r>
+        <w:t>console.log(</w:t>
+      </w:r>
+      <w:proofErr w:type="gramEnd"/>
+      <w:r>
+        <w:t>) :</w:t>
       </w:r>
     </w:p>
     <w:p>
@@ -1573,11 +2613,47 @@
           <w:lang w:val="en-US"/>
         </w:rPr>
       </w:pPr>
+      <w:proofErr w:type="gramStart"/>
       <w:r>
         <w:rPr>
           <w:lang w:val="en-US"/>
         </w:rPr>
-        <w:t>for(let materia in calificaciones){</w:t>
+        <w:t>for(</w:t>
+      </w:r>
+      <w:proofErr w:type="gramEnd"/>
+      <w:r>
+        <w:rPr>
+          <w:lang w:val="en-US"/>
+        </w:rPr>
+        <w:t xml:space="preserve">let </w:t>
+      </w:r>
+      <w:proofErr w:type="spellStart"/>
+      <w:r>
+        <w:rPr>
+          <w:lang w:val="en-US"/>
+        </w:rPr>
+        <w:t>materia</w:t>
+      </w:r>
+      <w:proofErr w:type="spellEnd"/>
+      <w:r>
+        <w:rPr>
+          <w:lang w:val="en-US"/>
+        </w:rPr>
+        <w:t xml:space="preserve"> in </w:t>
+      </w:r>
+      <w:proofErr w:type="spellStart"/>
+      <w:r>
+        <w:rPr>
+          <w:lang w:val="en-US"/>
+        </w:rPr>
+        <w:t>calificaciones</w:t>
+      </w:r>
+      <w:proofErr w:type="spellEnd"/>
+      <w:r>
+        <w:rPr>
+          <w:lang w:val="en-US"/>
+        </w:rPr>
+        <w:t>){</w:t>
       </w:r>
     </w:p>
     <w:p>
@@ -1590,8 +2666,13 @@
         </w:rPr>
         <w:t xml:space="preserve">    </w:t>
       </w:r>
-      <w:r>
-        <w:t>console.log(materia, ":", calificaciones[materia]);</w:t>
+      <w:proofErr w:type="gramStart"/>
+      <w:r>
+        <w:t>console.log(</w:t>
+      </w:r>
+      <w:proofErr w:type="gramEnd"/>
+      <w:r>
+        <w:t>materia, ":", calificaciones[materia]);</w:t>
       </w:r>
     </w:p>
     <w:p>
@@ -1610,6 +2691,7 @@
         <w:t>};</w:t>
       </w:r>
     </w:p>
+    <w:p/>
     <w:p/>
     <w:p>
       <w:pPr>
@@ -1620,7 +2702,47 @@
         </w:numPr>
       </w:pPr>
       <w:r>
-        <w:t>En el ejercicio nro 13 para la función esMayorDeEdad(value) no hace falta hacer un if, ya que la misma condición lógica va devolver con el return “true o false”:</w:t>
+        <w:t xml:space="preserve">En el ejercicio </w:t>
+      </w:r>
+      <w:proofErr w:type="spellStart"/>
+      <w:r>
+        <w:t>nro</w:t>
+      </w:r>
+      <w:proofErr w:type="spellEnd"/>
+      <w:r>
+        <w:t xml:space="preserve"> 13 para la función </w:t>
+      </w:r>
+      <w:proofErr w:type="spellStart"/>
+      <w:r>
+        <w:t>esMayorDeEdad</w:t>
+      </w:r>
+      <w:proofErr w:type="spellEnd"/>
+      <w:r>
+        <w:t>(</w:t>
+      </w:r>
+      <w:proofErr w:type="spellStart"/>
+      <w:r>
+        <w:t>value</w:t>
+      </w:r>
+      <w:proofErr w:type="spellEnd"/>
+      <w:r>
+        <w:t xml:space="preserve">) no hace falta hacer un </w:t>
+      </w:r>
+      <w:proofErr w:type="spellStart"/>
+      <w:r>
+        <w:t>if</w:t>
+      </w:r>
+      <w:proofErr w:type="spellEnd"/>
+      <w:r>
+        <w:t xml:space="preserve">, ya que la misma condición lógica va devolver con el </w:t>
+      </w:r>
+      <w:proofErr w:type="spellStart"/>
+      <w:r>
+        <w:t>return</w:t>
+      </w:r>
+      <w:proofErr w:type="spellEnd"/>
+      <w:r>
+        <w:t xml:space="preserve"> “true o false”:</w:t>
       </w:r>
     </w:p>
     <w:p/>
@@ -1628,8 +2750,22 @@
       <w:pPr>
         <w:ind w:left="1416"/>
       </w:pPr>
-      <w:r>
-        <w:t>function esMayorDeEdad(edad) {</w:t>
+      <w:proofErr w:type="spellStart"/>
+      <w:r>
+        <w:lastRenderedPageBreak/>
+        <w:t>function</w:t>
+      </w:r>
+      <w:proofErr w:type="spellEnd"/>
+      <w:r>
+        <w:t xml:space="preserve"> </w:t>
+      </w:r>
+      <w:proofErr w:type="spellStart"/>
+      <w:r>
+        <w:t>esMayorDeEdad</w:t>
+      </w:r>
+      <w:proofErr w:type="spellEnd"/>
+      <w:r>
+        <w:t>(edad) {</w:t>
       </w:r>
     </w:p>
     <w:p>
@@ -1637,7 +2773,15 @@
         <w:ind w:left="1416"/>
       </w:pPr>
       <w:r>
-        <w:t>  return edad &gt;= 18;</w:t>
+        <w:t xml:space="preserve">  </w:t>
+      </w:r>
+      <w:proofErr w:type="spellStart"/>
+      <w:r>
+        <w:t>return</w:t>
+      </w:r>
+      <w:proofErr w:type="spellEnd"/>
+      <w:r>
+        <w:t xml:space="preserve"> edad &gt;= 18;</w:t>
       </w:r>
     </w:p>
     <w:p>
@@ -1645,10 +2789,10 @@
         <w:ind w:left="1416"/>
       </w:pPr>
       <w:r>
-        <w:lastRenderedPageBreak/>
         <w:t>}</w:t>
       </w:r>
     </w:p>
+    <w:p/>
     <w:p/>
     <w:p>
       <w:pPr>
@@ -1659,7 +2803,31 @@
         </w:numPr>
       </w:pPr>
       <w:r>
-        <w:t>Ejercicio nro 13: la anterior función con sintaxis de arrow function quedaría así:</w:t>
+        <w:t xml:space="preserve">Ejercicio </w:t>
+      </w:r>
+      <w:proofErr w:type="spellStart"/>
+      <w:r>
+        <w:t>nro</w:t>
+      </w:r>
+      <w:proofErr w:type="spellEnd"/>
+      <w:r>
+        <w:t xml:space="preserve"> 13: la anterior función con sintaxis de </w:t>
+      </w:r>
+      <w:proofErr w:type="spellStart"/>
+      <w:r>
+        <w:t>arrow</w:t>
+      </w:r>
+      <w:proofErr w:type="spellEnd"/>
+      <w:r>
+        <w:t xml:space="preserve"> </w:t>
+      </w:r>
+      <w:proofErr w:type="spellStart"/>
+      <w:r>
+        <w:t>function</w:t>
+      </w:r>
+      <w:proofErr w:type="spellEnd"/>
+      <w:r>
+        <w:t xml:space="preserve"> quedaría así:</w:t>
       </w:r>
     </w:p>
     <w:p>
@@ -1671,8 +2839,21 @@
       <w:pPr>
         <w:ind w:left="1416"/>
       </w:pPr>
-      <w:r>
-        <w:t>const esMayorDeEdadFn = (edad) =&gt; edad &gt;= 18;</w:t>
+      <w:proofErr w:type="spellStart"/>
+      <w:r>
+        <w:t>const</w:t>
+      </w:r>
+      <w:proofErr w:type="spellEnd"/>
+      <w:r>
+        <w:t xml:space="preserve"> </w:t>
+      </w:r>
+      <w:proofErr w:type="spellStart"/>
+      <w:r>
+        <w:t>esMayorDeEdadFn</w:t>
+      </w:r>
+      <w:proofErr w:type="spellEnd"/>
+      <w:r>
+        <w:t xml:space="preserve"> = (edad) =&gt; edad &gt;= 18;</w:t>
       </w:r>
     </w:p>
     <w:p/>
@@ -1743,6 +2924,7 @@
           <w:rFonts w:ascii="Segoe UI Emoji" w:hAnsi="Segoe UI Emoji" w:cs="Segoe UI Emoji"/>
         </w:rPr>
       </w:pPr>
+      <w:proofErr w:type="gramStart"/>
       <w:r>
         <w:rPr>
           <w:rFonts w:ascii="Segoe UI Emoji" w:hAnsi="Segoe UI Emoji" w:cs="Segoe UI Emoji"/>
@@ -1750,7 +2932,11 @@
         <w:t>🎉</w:t>
       </w:r>
       <w:r>
-        <w:t>¡Felicitaciones por la entrega del Desafío 0</w:t>
+        <w:t>¡</w:t>
+      </w:r>
+      <w:proofErr w:type="gramEnd"/>
+      <w:r>
+        <w:t>Felicitaciones por la entrega del Desafío 0</w:t>
       </w:r>
       <w:r>
         <w:t>7</w:t>
@@ -1792,10 +2978,34 @@
         <w:t xml:space="preserve"> para recorrer </w:t>
       </w:r>
       <w:r>
-        <w:t>para arrays y objetos</w:t>
-      </w:r>
-      <w:r>
-        <w:t>, diferenciaste correctamente los métodos splice y slice.</w:t>
+        <w:t xml:space="preserve">para </w:t>
+      </w:r>
+      <w:proofErr w:type="spellStart"/>
+      <w:r>
+        <w:t>arrays</w:t>
+      </w:r>
+      <w:proofErr w:type="spellEnd"/>
+      <w:r>
+        <w:t xml:space="preserve"> y objetos</w:t>
+      </w:r>
+      <w:r>
+        <w:t xml:space="preserve">, diferenciaste correctamente los métodos </w:t>
+      </w:r>
+      <w:proofErr w:type="spellStart"/>
+      <w:r>
+        <w:t>splice</w:t>
+      </w:r>
+      <w:proofErr w:type="spellEnd"/>
+      <w:r>
+        <w:t xml:space="preserve"> y </w:t>
+      </w:r>
+      <w:proofErr w:type="spellStart"/>
+      <w:r>
+        <w:t>slice</w:t>
+      </w:r>
+      <w:proofErr w:type="spellEnd"/>
+      <w:r>
+        <w:t>.</w:t>
       </w:r>
       <w:r>
         <w:t xml:space="preserve"> </w:t>
@@ -1810,8 +3020,29 @@
     <w:p/>
     <w:p>
       <w:r>
-        <w:t>Buenísimo que te manejaste con template literals en lugar de concatenar strings</w:t>
-      </w:r>
+        <w:t xml:space="preserve">Buenísimo que te manejaste con </w:t>
+      </w:r>
+      <w:proofErr w:type="spellStart"/>
+      <w:r>
+        <w:t>template</w:t>
+      </w:r>
+      <w:proofErr w:type="spellEnd"/>
+      <w:r>
+        <w:t xml:space="preserve"> </w:t>
+      </w:r>
+      <w:proofErr w:type="spellStart"/>
+      <w:r>
+        <w:t>literals</w:t>
+      </w:r>
+      <w:proofErr w:type="spellEnd"/>
+      <w:r>
+        <w:t xml:space="preserve"> en lugar de concatenar </w:t>
+      </w:r>
+      <w:proofErr w:type="spellStart"/>
+      <w:r>
+        <w:t>strings</w:t>
+      </w:r>
+      <w:proofErr w:type="spellEnd"/>
       <w:r>
         <w:t xml:space="preserve"> y que utilizaste condicionales ternarios.</w:t>
       </w:r>
@@ -1819,6 +3050,7 @@
     <w:p/>
     <w:p>
       <w:r>
+        <w:lastRenderedPageBreak/>
         <w:t>Quiero destacar la prolijidad de tu código.</w:t>
       </w:r>
     </w:p>
@@ -1826,7 +3058,6 @@
     <w:p/>
     <w:p>
       <w:r>
-        <w:lastRenderedPageBreak/>
         <w:t>Muy buen trabajo ¡</w:t>
       </w:r>
     </w:p>
@@ -1899,6 +3130,7 @@
           <w:rFonts w:ascii="Segoe UI Emoji" w:hAnsi="Segoe UI Emoji" w:cs="Segoe UI Emoji"/>
         </w:rPr>
       </w:pPr>
+      <w:proofErr w:type="gramStart"/>
       <w:r>
         <w:rPr>
           <w:rFonts w:ascii="Segoe UI Emoji" w:hAnsi="Segoe UI Emoji" w:cs="Segoe UI Emoji"/>
@@ -1906,7 +3138,11 @@
         <w:t>🎉</w:t>
       </w:r>
       <w:r>
-        <w:t xml:space="preserve">¡Felicitaciones por la entrega del Desafío 07! </w:t>
+        <w:t>¡</w:t>
+      </w:r>
+      <w:proofErr w:type="gramEnd"/>
+      <w:r>
+        <w:t xml:space="preserve">Felicitaciones por la entrega del Desafío 07! </w:t>
       </w:r>
       <w:r>
         <w:rPr>
@@ -1918,16 +3154,37 @@
     <w:p/>
     <w:p>
       <w:r>
-        <w:t>Ariana</w:t>
-      </w:r>
-      <w:r>
-        <w:t>, excelente trabajo, te felicito por el compromiso en realizar las entregas.</w:t>
-      </w:r>
-    </w:p>
-    <w:p/>
-    <w:p>
-      <w:r>
-        <w:t xml:space="preserve">Excelente la implementación de métodos para recorrer para arrays y objetos, diferenciaste correctamente los métodos splice y slice. </w:t>
+        <w:t>Ariana, excelente trabajo, te felicito por el compromiso en realizar las entregas.</w:t>
+      </w:r>
+    </w:p>
+    <w:p/>
+    <w:p>
+      <w:r>
+        <w:t xml:space="preserve">Excelente la implementación de métodos para recorrer para </w:t>
+      </w:r>
+      <w:proofErr w:type="spellStart"/>
+      <w:r>
+        <w:t>arrays</w:t>
+      </w:r>
+      <w:proofErr w:type="spellEnd"/>
+      <w:r>
+        <w:t xml:space="preserve"> y objetos, diferenciaste correctamente los métodos </w:t>
+      </w:r>
+      <w:proofErr w:type="spellStart"/>
+      <w:r>
+        <w:t>splice</w:t>
+      </w:r>
+      <w:proofErr w:type="spellEnd"/>
+      <w:r>
+        <w:t xml:space="preserve"> y </w:t>
+      </w:r>
+      <w:proofErr w:type="spellStart"/>
+      <w:r>
+        <w:t>slice</w:t>
+      </w:r>
+      <w:proofErr w:type="spellEnd"/>
+      <w:r>
+        <w:t xml:space="preserve">. </w:t>
       </w:r>
     </w:p>
     <w:p/>
@@ -1939,10 +3196,42 @@
     <w:p/>
     <w:p>
       <w:r>
-        <w:t xml:space="preserve">Buenísimo que te manejaste con template literals en lugar de concatenar strings. </w:t>
-      </w:r>
-      <w:r>
-        <w:t>Genial que hiciste el punto adicional en el ultimo ejercicio.</w:t>
+        <w:t xml:space="preserve">Buenísimo que te manejaste con </w:t>
+      </w:r>
+      <w:proofErr w:type="spellStart"/>
+      <w:r>
+        <w:t>template</w:t>
+      </w:r>
+      <w:proofErr w:type="spellEnd"/>
+      <w:r>
+        <w:t xml:space="preserve"> </w:t>
+      </w:r>
+      <w:proofErr w:type="spellStart"/>
+      <w:r>
+        <w:t>literals</w:t>
+      </w:r>
+      <w:proofErr w:type="spellEnd"/>
+      <w:r>
+        <w:t xml:space="preserve"> en lugar de concatenar </w:t>
+      </w:r>
+      <w:proofErr w:type="spellStart"/>
+      <w:r>
+        <w:t>strings</w:t>
+      </w:r>
+      <w:proofErr w:type="spellEnd"/>
+      <w:r>
+        <w:t xml:space="preserve">. </w:t>
+      </w:r>
+      <w:r>
+        <w:t xml:space="preserve">Genial que hiciste el punto adicional en el </w:t>
+      </w:r>
+      <w:proofErr w:type="spellStart"/>
+      <w:r>
+        <w:t>ultimo</w:t>
+      </w:r>
+      <w:proofErr w:type="spellEnd"/>
+      <w:r>
+        <w:t xml:space="preserve"> ejercicio.</w:t>
       </w:r>
     </w:p>
     <w:p/>
@@ -1967,8 +3256,21 @@
           <w:numId w:val="6"/>
         </w:numPr>
       </w:pPr>
-      <w:r>
-        <w:t xml:space="preserve">Recorda que para poder insertar expresiones JS (${…}) en textos necesitas los backticks  </w:t>
+      <w:proofErr w:type="spellStart"/>
+      <w:r>
+        <w:t>Recorda</w:t>
+      </w:r>
+      <w:proofErr w:type="spellEnd"/>
+      <w:r>
+        <w:t xml:space="preserve"> que para poder insertar expresiones JS (${…}) en textos necesitas los </w:t>
+      </w:r>
+      <w:proofErr w:type="spellStart"/>
+      <w:r>
+        <w:t>backticks</w:t>
+      </w:r>
+      <w:proofErr w:type="spellEnd"/>
+      <w:r>
+        <w:t xml:space="preserve">  </w:t>
       </w:r>
     </w:p>
     <w:p>
@@ -1984,7 +3286,15 @@
         <w:tab/>
       </w:r>
       <w:r>
-        <w:t>console.log(`${materia}: ${calificaciones[materia]}`);</w:t>
+        <w:t>console.log(`${materia}: ${calificaciones[materia</w:t>
+      </w:r>
+      <w:proofErr w:type="gramStart"/>
+      <w:r>
+        <w:t>]}`</w:t>
+      </w:r>
+      <w:proofErr w:type="gramEnd"/>
+      <w:r>
+        <w:t>);</w:t>
       </w:r>
     </w:p>
     <w:p/>
@@ -2004,7 +3314,31 @@
         </w:numPr>
       </w:pPr>
       <w:r>
-        <w:t>En el Ejercicio nro 10 podes realizar la sumatoria de notas en el primer bucle for junto con el console.log() :</w:t>
+        <w:t xml:space="preserve">En el Ejercicio </w:t>
+      </w:r>
+      <w:proofErr w:type="spellStart"/>
+      <w:r>
+        <w:t>nro</w:t>
+      </w:r>
+      <w:proofErr w:type="spellEnd"/>
+      <w:r>
+        <w:t xml:space="preserve"> 10 podes realizar la sumatoria de notas en el primer bucle </w:t>
+      </w:r>
+      <w:proofErr w:type="spellStart"/>
+      <w:r>
+        <w:t>for</w:t>
+      </w:r>
+      <w:proofErr w:type="spellEnd"/>
+      <w:r>
+        <w:t xml:space="preserve"> junto con el </w:t>
+      </w:r>
+      <w:proofErr w:type="gramStart"/>
+      <w:r>
+        <w:t>console.log(</w:t>
+      </w:r>
+      <w:proofErr w:type="gramEnd"/>
+      <w:r>
+        <w:t>) :</w:t>
       </w:r>
     </w:p>
     <w:p>
@@ -2019,11 +3353,47 @@
           <w:lang w:val="en-US"/>
         </w:rPr>
       </w:pPr>
+      <w:proofErr w:type="gramStart"/>
       <w:r>
         <w:rPr>
           <w:lang w:val="en-US"/>
         </w:rPr>
-        <w:t>for(let materia in calificaciones){</w:t>
+        <w:t>for(</w:t>
+      </w:r>
+      <w:proofErr w:type="gramEnd"/>
+      <w:r>
+        <w:rPr>
+          <w:lang w:val="en-US"/>
+        </w:rPr>
+        <w:t xml:space="preserve">let </w:t>
+      </w:r>
+      <w:proofErr w:type="spellStart"/>
+      <w:r>
+        <w:rPr>
+          <w:lang w:val="en-US"/>
+        </w:rPr>
+        <w:t>materia</w:t>
+      </w:r>
+      <w:proofErr w:type="spellEnd"/>
+      <w:r>
+        <w:rPr>
+          <w:lang w:val="en-US"/>
+        </w:rPr>
+        <w:t xml:space="preserve"> in </w:t>
+      </w:r>
+      <w:proofErr w:type="spellStart"/>
+      <w:r>
+        <w:rPr>
+          <w:lang w:val="en-US"/>
+        </w:rPr>
+        <w:t>calificaciones</w:t>
+      </w:r>
+      <w:proofErr w:type="spellEnd"/>
+      <w:r>
+        <w:rPr>
+          <w:lang w:val="en-US"/>
+        </w:rPr>
+        <w:t>){</w:t>
       </w:r>
     </w:p>
     <w:p>
@@ -2036,8 +3406,13 @@
         </w:rPr>
         <w:t xml:space="preserve">    </w:t>
       </w:r>
-      <w:r>
-        <w:t>console.log(materia, ":", calificaciones[materia]);</w:t>
+      <w:proofErr w:type="gramStart"/>
+      <w:r>
+        <w:t>console.log(</w:t>
+      </w:r>
+      <w:proofErr w:type="gramEnd"/>
+      <w:r>
+        <w:t>materia, ":", calificaciones[materia]);</w:t>
       </w:r>
     </w:p>
     <w:p>
@@ -2094,30 +3469,41 @@
           <w:bCs/>
         </w:rPr>
       </w:pPr>
-      <w:r>
-        <w:rPr>
-          <w:rFonts w:ascii="Segoe UI Emoji" w:hAnsi="Segoe UI Emoji" w:cs="Segoe UI Emoji"/>
-          <w:b/>
-          <w:bCs/>
-        </w:rPr>
-        <w:t>Perezlindo Franco</w:t>
-      </w:r>
-    </w:p>
-    <w:p>
-      <w:pPr>
-        <w:rPr>
-          <w:rFonts w:ascii="Segoe UI Emoji" w:hAnsi="Segoe UI Emoji" w:cs="Segoe UI Emoji"/>
-          <w:b/>
-          <w:bCs/>
-        </w:rPr>
-      </w:pPr>
-    </w:p>
-    <w:p>
-      <w:pPr>
-        <w:rPr>
-          <w:rFonts w:ascii="Segoe UI Emoji" w:hAnsi="Segoe UI Emoji" w:cs="Segoe UI Emoji"/>
-        </w:rPr>
-      </w:pPr>
+      <w:proofErr w:type="spellStart"/>
+      <w:r>
+        <w:rPr>
+          <w:rFonts w:ascii="Segoe UI Emoji" w:hAnsi="Segoe UI Emoji" w:cs="Segoe UI Emoji"/>
+          <w:b/>
+          <w:bCs/>
+        </w:rPr>
+        <w:t>Perezlindo</w:t>
+      </w:r>
+      <w:proofErr w:type="spellEnd"/>
+      <w:r>
+        <w:rPr>
+          <w:rFonts w:ascii="Segoe UI Emoji" w:hAnsi="Segoe UI Emoji" w:cs="Segoe UI Emoji"/>
+          <w:b/>
+          <w:bCs/>
+        </w:rPr>
+        <w:t xml:space="preserve"> Franco</w:t>
+      </w:r>
+    </w:p>
+    <w:p>
+      <w:pPr>
+        <w:rPr>
+          <w:rFonts w:ascii="Segoe UI Emoji" w:hAnsi="Segoe UI Emoji" w:cs="Segoe UI Emoji"/>
+          <w:b/>
+          <w:bCs/>
+        </w:rPr>
+      </w:pPr>
+    </w:p>
+    <w:p>
+      <w:pPr>
+        <w:rPr>
+          <w:rFonts w:ascii="Segoe UI Emoji" w:hAnsi="Segoe UI Emoji" w:cs="Segoe UI Emoji"/>
+        </w:rPr>
+      </w:pPr>
+      <w:proofErr w:type="gramStart"/>
       <w:r>
         <w:rPr>
           <w:rFonts w:ascii="Segoe UI Emoji" w:hAnsi="Segoe UI Emoji" w:cs="Segoe UI Emoji"/>
@@ -2125,7 +3511,11 @@
         <w:t>🎉</w:t>
       </w:r>
       <w:r>
-        <w:t xml:space="preserve">¡Felicitaciones por la entrega del Desafío 07! </w:t>
+        <w:t>¡</w:t>
+      </w:r>
+      <w:proofErr w:type="gramEnd"/>
+      <w:r>
+        <w:t xml:space="preserve">Felicitaciones por la entrega del Desafío 07! </w:t>
       </w:r>
       <w:r>
         <w:rPr>
@@ -2137,16 +3527,37 @@
     <w:p/>
     <w:p>
       <w:r>
-        <w:t>Franco</w:t>
-      </w:r>
-      <w:r>
-        <w:t>, excelente trabajo, te felicito por el compromiso en realizar las entregas.</w:t>
-      </w:r>
-    </w:p>
-    <w:p/>
-    <w:p>
-      <w:r>
-        <w:t xml:space="preserve">Excelente la implementación de métodos para recorrer para arrays y objetos, diferenciaste correctamente los métodos splice y slice. </w:t>
+        <w:t>Franco, excelente trabajo, te felicito por el compromiso en realizar las entregas.</w:t>
+      </w:r>
+    </w:p>
+    <w:p/>
+    <w:p>
+      <w:r>
+        <w:t xml:space="preserve">Excelente la implementación de métodos para recorrer para </w:t>
+      </w:r>
+      <w:proofErr w:type="spellStart"/>
+      <w:r>
+        <w:t>arrays</w:t>
+      </w:r>
+      <w:proofErr w:type="spellEnd"/>
+      <w:r>
+        <w:t xml:space="preserve"> y objetos, diferenciaste correctamente los métodos </w:t>
+      </w:r>
+      <w:proofErr w:type="spellStart"/>
+      <w:r>
+        <w:t>splice</w:t>
+      </w:r>
+      <w:proofErr w:type="spellEnd"/>
+      <w:r>
+        <w:t xml:space="preserve"> y </w:t>
+      </w:r>
+      <w:proofErr w:type="spellStart"/>
+      <w:r>
+        <w:t>slice</w:t>
+      </w:r>
+      <w:proofErr w:type="spellEnd"/>
+      <w:r>
+        <w:t xml:space="preserve">. </w:t>
       </w:r>
     </w:p>
     <w:p/>
@@ -2158,7 +3569,40 @@
     <w:p/>
     <w:p>
       <w:r>
-        <w:t>Buenísimo que te manejaste con template literals en lugar de concatenar strings. Genial que hiciste el punto adicional en el ultimo ejercicio.</w:t>
+        <w:lastRenderedPageBreak/>
+        <w:t xml:space="preserve">Buenísimo que te manejaste con </w:t>
+      </w:r>
+      <w:proofErr w:type="spellStart"/>
+      <w:r>
+        <w:t>template</w:t>
+      </w:r>
+      <w:proofErr w:type="spellEnd"/>
+      <w:r>
+        <w:t xml:space="preserve"> </w:t>
+      </w:r>
+      <w:proofErr w:type="spellStart"/>
+      <w:r>
+        <w:t>literals</w:t>
+      </w:r>
+      <w:proofErr w:type="spellEnd"/>
+      <w:r>
+        <w:t xml:space="preserve"> en lugar de concatenar </w:t>
+      </w:r>
+      <w:proofErr w:type="spellStart"/>
+      <w:r>
+        <w:t>strings</w:t>
+      </w:r>
+      <w:proofErr w:type="spellEnd"/>
+      <w:r>
+        <w:t xml:space="preserve">. Genial que hiciste el punto adicional en el </w:t>
+      </w:r>
+      <w:proofErr w:type="spellStart"/>
+      <w:r>
+        <w:t>ultimo</w:t>
+      </w:r>
+      <w:proofErr w:type="spellEnd"/>
+      <w:r>
+        <w:t xml:space="preserve"> ejercicio.</w:t>
       </w:r>
     </w:p>
     <w:p/>
@@ -2185,7 +3629,31 @@
         </w:numPr>
       </w:pPr>
       <w:r>
-        <w:t>En el Ejercicio nro 10 podes realizar la sumatoria de notas en el primer bucle for junto con el console.log() :</w:t>
+        <w:t xml:space="preserve">En el Ejercicio </w:t>
+      </w:r>
+      <w:proofErr w:type="spellStart"/>
+      <w:r>
+        <w:t>nro</w:t>
+      </w:r>
+      <w:proofErr w:type="spellEnd"/>
+      <w:r>
+        <w:t xml:space="preserve"> 10 podes realizar la sumatoria de notas en el primer bucle </w:t>
+      </w:r>
+      <w:proofErr w:type="spellStart"/>
+      <w:r>
+        <w:t>for</w:t>
+      </w:r>
+      <w:proofErr w:type="spellEnd"/>
+      <w:r>
+        <w:t xml:space="preserve"> junto con el </w:t>
+      </w:r>
+      <w:proofErr w:type="gramStart"/>
+      <w:r>
+        <w:t>console.log(</w:t>
+      </w:r>
+      <w:proofErr w:type="gramEnd"/>
+      <w:r>
+        <w:t>) :</w:t>
       </w:r>
     </w:p>
     <w:p>
@@ -2200,11 +3668,47 @@
           <w:lang w:val="en-US"/>
         </w:rPr>
       </w:pPr>
+      <w:proofErr w:type="gramStart"/>
       <w:r>
         <w:rPr>
           <w:lang w:val="en-US"/>
         </w:rPr>
-        <w:t>for(let materia in calificaciones){</w:t>
+        <w:t>for(</w:t>
+      </w:r>
+      <w:proofErr w:type="gramEnd"/>
+      <w:r>
+        <w:rPr>
+          <w:lang w:val="en-US"/>
+        </w:rPr>
+        <w:t xml:space="preserve">let </w:t>
+      </w:r>
+      <w:proofErr w:type="spellStart"/>
+      <w:r>
+        <w:rPr>
+          <w:lang w:val="en-US"/>
+        </w:rPr>
+        <w:t>materia</w:t>
+      </w:r>
+      <w:proofErr w:type="spellEnd"/>
+      <w:r>
+        <w:rPr>
+          <w:lang w:val="en-US"/>
+        </w:rPr>
+        <w:t xml:space="preserve"> in </w:t>
+      </w:r>
+      <w:proofErr w:type="spellStart"/>
+      <w:r>
+        <w:rPr>
+          <w:lang w:val="en-US"/>
+        </w:rPr>
+        <w:t>calificaciones</w:t>
+      </w:r>
+      <w:proofErr w:type="spellEnd"/>
+      <w:r>
+        <w:rPr>
+          <w:lang w:val="en-US"/>
+        </w:rPr>
+        <w:t>){</w:t>
       </w:r>
     </w:p>
     <w:p>
@@ -2217,8 +3721,13 @@
         </w:rPr>
         <w:t xml:space="preserve">    </w:t>
       </w:r>
-      <w:r>
-        <w:t>console.log(materia, ":", calificaciones[materia]);</w:t>
+      <w:proofErr w:type="gramStart"/>
+      <w:r>
+        <w:t>console.log(</w:t>
+      </w:r>
+      <w:proofErr w:type="gramEnd"/>
+      <w:r>
+        <w:t>materia, ":", calificaciones[materia]);</w:t>
       </w:r>
     </w:p>
     <w:p>
@@ -2281,14 +3790,52 @@
           <w:bCs/>
         </w:rPr>
       </w:pPr>
-      <w:r>
-        <w:rPr>
-          <w:rFonts w:ascii="Segoe UI Emoji" w:hAnsi="Segoe UI Emoji" w:cs="Segoe UI Emoji"/>
-          <w:b/>
-          <w:bCs/>
-        </w:rPr>
-        <w:t>Zuñiga Hernandez Carlos Andres</w:t>
-      </w:r>
+      <w:proofErr w:type="spellStart"/>
+      <w:r>
+        <w:rPr>
+          <w:rFonts w:ascii="Segoe UI Emoji" w:hAnsi="Segoe UI Emoji" w:cs="Segoe UI Emoji"/>
+          <w:b/>
+          <w:bCs/>
+        </w:rPr>
+        <w:t>Zuñiga</w:t>
+      </w:r>
+      <w:proofErr w:type="spellEnd"/>
+      <w:r>
+        <w:rPr>
+          <w:rFonts w:ascii="Segoe UI Emoji" w:hAnsi="Segoe UI Emoji" w:cs="Segoe UI Emoji"/>
+          <w:b/>
+          <w:bCs/>
+        </w:rPr>
+        <w:t xml:space="preserve"> </w:t>
+      </w:r>
+      <w:proofErr w:type="spellStart"/>
+      <w:r>
+        <w:rPr>
+          <w:rFonts w:ascii="Segoe UI Emoji" w:hAnsi="Segoe UI Emoji" w:cs="Segoe UI Emoji"/>
+          <w:b/>
+          <w:bCs/>
+        </w:rPr>
+        <w:t>Hernandez</w:t>
+      </w:r>
+      <w:proofErr w:type="spellEnd"/>
+      <w:r>
+        <w:rPr>
+          <w:rFonts w:ascii="Segoe UI Emoji" w:hAnsi="Segoe UI Emoji" w:cs="Segoe UI Emoji"/>
+          <w:b/>
+          <w:bCs/>
+        </w:rPr>
+        <w:t xml:space="preserve"> Carlos </w:t>
+      </w:r>
+      <w:proofErr w:type="spellStart"/>
+      <w:r>
+        <w:rPr>
+          <w:rFonts w:ascii="Segoe UI Emoji" w:hAnsi="Segoe UI Emoji" w:cs="Segoe UI Emoji"/>
+          <w:b/>
+          <w:bCs/>
+        </w:rPr>
+        <w:t>Andres</w:t>
+      </w:r>
+      <w:proofErr w:type="spellEnd"/>
     </w:p>
     <w:p>
       <w:pPr>
@@ -2307,6 +3854,7 @@
           <w:rFonts w:ascii="Segoe UI Emoji" w:hAnsi="Segoe UI Emoji" w:cs="Segoe UI Emoji"/>
         </w:rPr>
       </w:pPr>
+      <w:proofErr w:type="gramStart"/>
       <w:r>
         <w:rPr>
           <w:rFonts w:ascii="Segoe UI Emoji" w:hAnsi="Segoe UI Emoji" w:cs="Segoe UI Emoji"/>
@@ -2314,7 +3862,11 @@
         <w:t>🎉</w:t>
       </w:r>
       <w:r>
-        <w:t xml:space="preserve">¡Felicitaciones por la entrega del Desafío 04! </w:t>
+        <w:t>¡</w:t>
+      </w:r>
+      <w:proofErr w:type="gramEnd"/>
+      <w:r>
+        <w:t xml:space="preserve">Felicitaciones por la entrega del Desafío 04! </w:t>
       </w:r>
       <w:r>
         <w:rPr>
@@ -2352,7 +3904,32 @@
         <w:ind w:left="708" w:hanging="708"/>
       </w:pPr>
       <w:r>
-        <w:t>La estructura HTML esta impecable, destaco la correcta implementación de contenedores semánticos como main, section, footer, etc.</w:t>
+        <w:lastRenderedPageBreak/>
+        <w:t xml:space="preserve">La estructura HTML esta impecable, destaco la correcta implementación de contenedores semánticos como </w:t>
+      </w:r>
+      <w:proofErr w:type="spellStart"/>
+      <w:r>
+        <w:t>main</w:t>
+      </w:r>
+      <w:proofErr w:type="spellEnd"/>
+      <w:r>
+        <w:t xml:space="preserve">, </w:t>
+      </w:r>
+      <w:proofErr w:type="spellStart"/>
+      <w:r>
+        <w:t>section</w:t>
+      </w:r>
+      <w:proofErr w:type="spellEnd"/>
+      <w:r>
+        <w:t xml:space="preserve">, </w:t>
+      </w:r>
+      <w:proofErr w:type="spellStart"/>
+      <w:r>
+        <w:t>footer</w:t>
+      </w:r>
+      <w:proofErr w:type="spellEnd"/>
+      <w:r>
+        <w:t>, etc.</w:t>
       </w:r>
     </w:p>
     <w:p>
@@ -2378,8 +3955,15 @@
         <w:ind w:left="708" w:hanging="708"/>
       </w:pPr>
       <w:r>
-        <w:lastRenderedPageBreak/>
-        <w:t>La disposición de elementos en la landing page quedo tal cual lo solicitado con la herramienta Flex.</w:t>
+        <w:t xml:space="preserve">La disposición de elementos en la </w:t>
+      </w:r>
+      <w:proofErr w:type="spellStart"/>
+      <w:r>
+        <w:t>landing</w:t>
+      </w:r>
+      <w:proofErr w:type="spellEnd"/>
+      <w:r>
+        <w:t xml:space="preserve"> page quedo tal cual lo solicitado con la herramienta Flex.</w:t>
       </w:r>
     </w:p>
     <w:p>
@@ -2479,6 +4063,7 @@
           <w:rFonts w:ascii="Segoe UI Emoji" w:hAnsi="Segoe UI Emoji" w:cs="Segoe UI Emoji"/>
         </w:rPr>
       </w:pPr>
+      <w:proofErr w:type="gramStart"/>
       <w:r>
         <w:rPr>
           <w:rFonts w:ascii="Segoe UI Emoji" w:hAnsi="Segoe UI Emoji" w:cs="Segoe UI Emoji"/>
@@ -2486,7 +4071,11 @@
         <w:t>🎉</w:t>
       </w:r>
       <w:r>
-        <w:t xml:space="preserve">¡Felicitaciones por la entrega del Desafío 01! </w:t>
+        <w:t>¡</w:t>
+      </w:r>
+      <w:proofErr w:type="gramEnd"/>
+      <w:r>
+        <w:t xml:space="preserve">Felicitaciones por la entrega del Desafío 01! </w:t>
       </w:r>
       <w:r>
         <w:rPr>
@@ -2516,7 +4105,23 @@
     <w:p/>
     <w:p>
       <w:r>
-        <w:t xml:space="preserve">Buenísimo que aplicaste etiquetas &lt;b&gt; para resaltar en negrita textos, te falto aplicar palabras claves con etiquetas &lt;strong&gt;, recorda que ayudan para que los motores de búsqueda entiendan mejor el contenido de tu documento web. </w:t>
+        <w:t>Buenísimo que aplicaste etiquetas &lt;b&gt; para resaltar en negrita textos, te falto aplicar palabras claves con etiquetas &lt;</w:t>
+      </w:r>
+      <w:proofErr w:type="spellStart"/>
+      <w:r>
+        <w:t>strong</w:t>
+      </w:r>
+      <w:proofErr w:type="spellEnd"/>
+      <w:r>
+        <w:t xml:space="preserve">&gt;, </w:t>
+      </w:r>
+      <w:proofErr w:type="spellStart"/>
+      <w:r>
+        <w:t>recorda</w:t>
+      </w:r>
+      <w:proofErr w:type="spellEnd"/>
+      <w:r>
+        <w:t xml:space="preserve"> que ayudan para que los motores de búsqueda entiendan mejor el contenido de tu documento web. </w:t>
       </w:r>
     </w:p>
     <w:p/>
@@ -2562,24 +4167,43 @@
           <w:b/>
           <w:bCs/>
         </w:rPr>
-        <w:t>Cabrera Kowalsky Sofia Abril</w:t>
-      </w:r>
-    </w:p>
-    <w:p>
-      <w:pPr>
-        <w:rPr>
-          <w:rFonts w:ascii="Segoe UI Emoji" w:hAnsi="Segoe UI Emoji" w:cs="Segoe UI Emoji"/>
-          <w:b/>
-          <w:bCs/>
-        </w:rPr>
-      </w:pPr>
-    </w:p>
-    <w:p>
-      <w:pPr>
-        <w:rPr>
-          <w:rFonts w:ascii="Segoe UI Emoji" w:hAnsi="Segoe UI Emoji" w:cs="Segoe UI Emoji"/>
-        </w:rPr>
-      </w:pPr>
+        <w:t xml:space="preserve">Cabrera </w:t>
+      </w:r>
+      <w:proofErr w:type="spellStart"/>
+      <w:r>
+        <w:rPr>
+          <w:rFonts w:ascii="Segoe UI Emoji" w:hAnsi="Segoe UI Emoji" w:cs="Segoe UI Emoji"/>
+          <w:b/>
+          <w:bCs/>
+        </w:rPr>
+        <w:t>Kowalsky</w:t>
+      </w:r>
+      <w:proofErr w:type="spellEnd"/>
+      <w:r>
+        <w:rPr>
+          <w:rFonts w:ascii="Segoe UI Emoji" w:hAnsi="Segoe UI Emoji" w:cs="Segoe UI Emoji"/>
+          <w:b/>
+          <w:bCs/>
+        </w:rPr>
+        <w:t xml:space="preserve"> Sofia Abril</w:t>
+      </w:r>
+    </w:p>
+    <w:p>
+      <w:pPr>
+        <w:rPr>
+          <w:rFonts w:ascii="Segoe UI Emoji" w:hAnsi="Segoe UI Emoji" w:cs="Segoe UI Emoji"/>
+          <w:b/>
+          <w:bCs/>
+        </w:rPr>
+      </w:pPr>
+    </w:p>
+    <w:p>
+      <w:pPr>
+        <w:rPr>
+          <w:rFonts w:ascii="Segoe UI Emoji" w:hAnsi="Segoe UI Emoji" w:cs="Segoe UI Emoji"/>
+        </w:rPr>
+      </w:pPr>
+      <w:proofErr w:type="gramStart"/>
       <w:r>
         <w:rPr>
           <w:rFonts w:ascii="Segoe UI Emoji" w:hAnsi="Segoe UI Emoji" w:cs="Segoe UI Emoji"/>
@@ -2587,7 +4211,11 @@
         <w:t>🎉</w:t>
       </w:r>
       <w:r>
-        <w:t xml:space="preserve">¡Felicitaciones por la entrega del Desafío 07! </w:t>
+        <w:t>¡</w:t>
+      </w:r>
+      <w:proofErr w:type="gramEnd"/>
+      <w:r>
+        <w:t xml:space="preserve">Felicitaciones por la entrega del Desafío 07! </w:t>
       </w:r>
       <w:r>
         <w:rPr>
@@ -2605,7 +4233,31 @@
     <w:p/>
     <w:p>
       <w:r>
-        <w:t xml:space="preserve">Excelente la implementación de métodos para recorrer para arrays y objetos, diferenciaste correctamente los métodos splice y slice. </w:t>
+        <w:t xml:space="preserve">Excelente la implementación de métodos para recorrer para </w:t>
+      </w:r>
+      <w:proofErr w:type="spellStart"/>
+      <w:r>
+        <w:t>arrays</w:t>
+      </w:r>
+      <w:proofErr w:type="spellEnd"/>
+      <w:r>
+        <w:t xml:space="preserve"> y objetos, diferenciaste correctamente los métodos </w:t>
+      </w:r>
+      <w:proofErr w:type="spellStart"/>
+      <w:r>
+        <w:t>splice</w:t>
+      </w:r>
+      <w:proofErr w:type="spellEnd"/>
+      <w:r>
+        <w:t xml:space="preserve"> y </w:t>
+      </w:r>
+      <w:proofErr w:type="spellStart"/>
+      <w:r>
+        <w:t>slice</w:t>
+      </w:r>
+      <w:proofErr w:type="spellEnd"/>
+      <w:r>
+        <w:t xml:space="preserve">. </w:t>
       </w:r>
     </w:p>
     <w:p/>
@@ -2617,7 +4269,31 @@
     <w:p/>
     <w:p>
       <w:r>
-        <w:t xml:space="preserve">Buenísimo que te manejaste con template literals en lugar de concatenar strings. </w:t>
+        <w:t xml:space="preserve">Buenísimo que te manejaste con </w:t>
+      </w:r>
+      <w:proofErr w:type="spellStart"/>
+      <w:r>
+        <w:t>template</w:t>
+      </w:r>
+      <w:proofErr w:type="spellEnd"/>
+      <w:r>
+        <w:t xml:space="preserve"> </w:t>
+      </w:r>
+      <w:proofErr w:type="spellStart"/>
+      <w:r>
+        <w:t>literals</w:t>
+      </w:r>
+      <w:proofErr w:type="spellEnd"/>
+      <w:r>
+        <w:t xml:space="preserve"> en lugar de concatenar </w:t>
+      </w:r>
+      <w:proofErr w:type="spellStart"/>
+      <w:r>
+        <w:t>strings</w:t>
+      </w:r>
+      <w:proofErr w:type="spellEnd"/>
+      <w:r>
+        <w:t xml:space="preserve">. </w:t>
       </w:r>
     </w:p>
     <w:p/>
@@ -2643,7 +4319,23 @@
         </w:numPr>
       </w:pPr>
       <w:r>
-        <w:t>Me hubiera gustado que utilices al operador ternario, por ejemplo en el ejercicio nro 5.</w:t>
+        <w:t xml:space="preserve">Me hubiera gustado que utilices al operador ternario, por </w:t>
+      </w:r>
+      <w:proofErr w:type="gramStart"/>
+      <w:r>
+        <w:t>ejemplo</w:t>
+      </w:r>
+      <w:proofErr w:type="gramEnd"/>
+      <w:r>
+        <w:t xml:space="preserve"> en el ejercicio </w:t>
+      </w:r>
+      <w:proofErr w:type="spellStart"/>
+      <w:r>
+        <w:t>nro</w:t>
+      </w:r>
+      <w:proofErr w:type="spellEnd"/>
+      <w:r>
+        <w:t xml:space="preserve"> 5.</w:t>
       </w:r>
     </w:p>
     <w:p/>
@@ -2656,7 +4348,23 @@
         </w:numPr>
       </w:pPr>
       <w:r>
-        <w:t>En el Ejercicio nro 14 podias utilizar directamente un switch.</w:t>
+        <w:t xml:space="preserve">En el Ejercicio </w:t>
+      </w:r>
+      <w:proofErr w:type="spellStart"/>
+      <w:r>
+        <w:t>nro</w:t>
+      </w:r>
+      <w:proofErr w:type="spellEnd"/>
+      <w:r>
+        <w:t xml:space="preserve"> 14 </w:t>
+      </w:r>
+      <w:proofErr w:type="spellStart"/>
+      <w:r>
+        <w:t>podias</w:t>
+      </w:r>
+      <w:proofErr w:type="spellEnd"/>
+      <w:r>
+        <w:t xml:space="preserve"> utilizar directamente un switch.</w:t>
       </w:r>
     </w:p>
     <w:p/>
@@ -2717,39 +4425,50 @@
           <w:bCs/>
         </w:rPr>
       </w:pPr>
-      <w:r>
-        <w:rPr>
-          <w:rFonts w:ascii="Segoe UI Emoji" w:hAnsi="Segoe UI Emoji" w:cs="Segoe UI Emoji"/>
-          <w:b/>
-          <w:bCs/>
-        </w:rPr>
-        <w:t>Imas Guerrero Catalina Eva</w:t>
-      </w:r>
-    </w:p>
-    <w:p>
-      <w:pPr>
-        <w:rPr>
-          <w:rFonts w:ascii="Segoe UI Emoji" w:hAnsi="Segoe UI Emoji" w:cs="Segoe UI Emoji"/>
-          <w:b/>
-          <w:bCs/>
-        </w:rPr>
-      </w:pPr>
-    </w:p>
-    <w:p>
-      <w:pPr>
-        <w:rPr>
-          <w:rFonts w:ascii="Segoe UI Emoji" w:hAnsi="Segoe UI Emoji" w:cs="Segoe UI Emoji"/>
-          <w:b/>
-          <w:bCs/>
-        </w:rPr>
-      </w:pPr>
-    </w:p>
-    <w:p>
-      <w:pPr>
-        <w:rPr>
-          <w:rFonts w:ascii="Segoe UI Emoji" w:hAnsi="Segoe UI Emoji" w:cs="Segoe UI Emoji"/>
-        </w:rPr>
-      </w:pPr>
+      <w:proofErr w:type="spellStart"/>
+      <w:r>
+        <w:rPr>
+          <w:rFonts w:ascii="Segoe UI Emoji" w:hAnsi="Segoe UI Emoji" w:cs="Segoe UI Emoji"/>
+          <w:b/>
+          <w:bCs/>
+        </w:rPr>
+        <w:t>Imas</w:t>
+      </w:r>
+      <w:proofErr w:type="spellEnd"/>
+      <w:r>
+        <w:rPr>
+          <w:rFonts w:ascii="Segoe UI Emoji" w:hAnsi="Segoe UI Emoji" w:cs="Segoe UI Emoji"/>
+          <w:b/>
+          <w:bCs/>
+        </w:rPr>
+        <w:t xml:space="preserve"> Guerrero Catalina Eva</w:t>
+      </w:r>
+    </w:p>
+    <w:p>
+      <w:pPr>
+        <w:rPr>
+          <w:rFonts w:ascii="Segoe UI Emoji" w:hAnsi="Segoe UI Emoji" w:cs="Segoe UI Emoji"/>
+          <w:b/>
+          <w:bCs/>
+        </w:rPr>
+      </w:pPr>
+    </w:p>
+    <w:p>
+      <w:pPr>
+        <w:rPr>
+          <w:rFonts w:ascii="Segoe UI Emoji" w:hAnsi="Segoe UI Emoji" w:cs="Segoe UI Emoji"/>
+          <w:b/>
+          <w:bCs/>
+        </w:rPr>
+      </w:pPr>
+    </w:p>
+    <w:p>
+      <w:pPr>
+        <w:rPr>
+          <w:rFonts w:ascii="Segoe UI Emoji" w:hAnsi="Segoe UI Emoji" w:cs="Segoe UI Emoji"/>
+        </w:rPr>
+      </w:pPr>
+      <w:proofErr w:type="gramStart"/>
       <w:r>
         <w:rPr>
           <w:rFonts w:ascii="Segoe UI Emoji" w:hAnsi="Segoe UI Emoji" w:cs="Segoe UI Emoji"/>
@@ -2757,7 +4476,11 @@
         <w:t>🎉</w:t>
       </w:r>
       <w:r>
-        <w:t xml:space="preserve">¡Felicitaciones por la entrega del Desafío 07! </w:t>
+        <w:t>¡</w:t>
+      </w:r>
+      <w:proofErr w:type="gramEnd"/>
+      <w:r>
+        <w:t xml:space="preserve">Felicitaciones por la entrega del Desafío 07! </w:t>
       </w:r>
       <w:r>
         <w:rPr>
@@ -2775,7 +4498,31 @@
     <w:p/>
     <w:p>
       <w:r>
-        <w:t xml:space="preserve">Excelente la implementación de métodos para recorrer para arrays y objetos, diferenciaste correctamente los métodos splice y slice. </w:t>
+        <w:t xml:space="preserve">Excelente la implementación de métodos para recorrer para </w:t>
+      </w:r>
+      <w:proofErr w:type="spellStart"/>
+      <w:r>
+        <w:t>arrays</w:t>
+      </w:r>
+      <w:proofErr w:type="spellEnd"/>
+      <w:r>
+        <w:t xml:space="preserve"> y objetos, diferenciaste correctamente los métodos </w:t>
+      </w:r>
+      <w:proofErr w:type="spellStart"/>
+      <w:r>
+        <w:t>splice</w:t>
+      </w:r>
+      <w:proofErr w:type="spellEnd"/>
+      <w:r>
+        <w:t xml:space="preserve"> y </w:t>
+      </w:r>
+      <w:proofErr w:type="spellStart"/>
+      <w:r>
+        <w:t>slice</w:t>
+      </w:r>
+      <w:proofErr w:type="spellEnd"/>
+      <w:r>
+        <w:t xml:space="preserve">. </w:t>
       </w:r>
     </w:p>
     <w:p/>
@@ -2787,8 +4534,29 @@
     <w:p/>
     <w:p>
       <w:r>
-        <w:t>Buenísimo que te manejaste con template literals en lugar de concatenar strings</w:t>
-      </w:r>
+        <w:t xml:space="preserve">Buenísimo que te manejaste con </w:t>
+      </w:r>
+      <w:proofErr w:type="spellStart"/>
+      <w:r>
+        <w:t>template</w:t>
+      </w:r>
+      <w:proofErr w:type="spellEnd"/>
+      <w:r>
+        <w:t xml:space="preserve"> </w:t>
+      </w:r>
+      <w:proofErr w:type="spellStart"/>
+      <w:r>
+        <w:t>literals</w:t>
+      </w:r>
+      <w:proofErr w:type="spellEnd"/>
+      <w:r>
+        <w:t xml:space="preserve"> en lugar de concatenar </w:t>
+      </w:r>
+      <w:proofErr w:type="spellStart"/>
+      <w:r>
+        <w:t>strings</w:t>
+      </w:r>
+      <w:proofErr w:type="spellEnd"/>
       <w:r>
         <w:t>.</w:t>
       </w:r>
@@ -2860,6 +4628,7 @@
           <w:rFonts w:ascii="Segoe UI Emoji" w:hAnsi="Segoe UI Emoji" w:cs="Segoe UI Emoji"/>
         </w:rPr>
       </w:pPr>
+      <w:proofErr w:type="gramStart"/>
       <w:r>
         <w:rPr>
           <w:rFonts w:ascii="Segoe UI Emoji" w:hAnsi="Segoe UI Emoji" w:cs="Segoe UI Emoji"/>
@@ -2867,7 +4636,11 @@
         <w:t>🎉</w:t>
       </w:r>
       <w:r>
-        <w:t xml:space="preserve">¡Felicitaciones por la entrega del Desafío 07! </w:t>
+        <w:t>¡</w:t>
+      </w:r>
+      <w:proofErr w:type="gramEnd"/>
+      <w:r>
+        <w:t xml:space="preserve">Felicitaciones por la entrega del Desafío 07! </w:t>
       </w:r>
       <w:r>
         <w:rPr>
@@ -2879,17 +4652,37 @@
     <w:p/>
     <w:p>
       <w:r>
-        <w:lastRenderedPageBreak/>
-        <w:t>Micaela</w:t>
-      </w:r>
-      <w:r>
-        <w:t>, excelente trabajo, te felicito por el compromiso en realizar las entregas.</w:t>
-      </w:r>
-    </w:p>
-    <w:p/>
-    <w:p>
-      <w:r>
-        <w:t xml:space="preserve">Excelente la implementación de métodos para recorrer para arrays y objetos, diferenciaste correctamente los métodos splice y slice. </w:t>
+        <w:t>Micaela, excelente trabajo, te felicito por el compromiso en realizar las entregas.</w:t>
+      </w:r>
+    </w:p>
+    <w:p/>
+    <w:p>
+      <w:r>
+        <w:t xml:space="preserve">Excelente la implementación de métodos para recorrer para </w:t>
+      </w:r>
+      <w:proofErr w:type="spellStart"/>
+      <w:r>
+        <w:t>arrays</w:t>
+      </w:r>
+      <w:proofErr w:type="spellEnd"/>
+      <w:r>
+        <w:t xml:space="preserve"> y objetos, diferenciaste correctamente los métodos </w:t>
+      </w:r>
+      <w:proofErr w:type="spellStart"/>
+      <w:r>
+        <w:t>splice</w:t>
+      </w:r>
+      <w:proofErr w:type="spellEnd"/>
+      <w:r>
+        <w:t xml:space="preserve"> y </w:t>
+      </w:r>
+      <w:proofErr w:type="spellStart"/>
+      <w:r>
+        <w:t>slice</w:t>
+      </w:r>
+      <w:proofErr w:type="spellEnd"/>
+      <w:r>
+        <w:t xml:space="preserve">. </w:t>
       </w:r>
     </w:p>
     <w:p/>
@@ -2901,7 +4694,31 @@
     <w:p/>
     <w:p>
       <w:r>
-        <w:t xml:space="preserve">Buenísimo que te manejaste con template literals en lugar de concatenar strings. </w:t>
+        <w:t xml:space="preserve">Buenísimo que te manejaste con </w:t>
+      </w:r>
+      <w:proofErr w:type="spellStart"/>
+      <w:r>
+        <w:t>template</w:t>
+      </w:r>
+      <w:proofErr w:type="spellEnd"/>
+      <w:r>
+        <w:t xml:space="preserve"> </w:t>
+      </w:r>
+      <w:proofErr w:type="spellStart"/>
+      <w:r>
+        <w:t>literals</w:t>
+      </w:r>
+      <w:proofErr w:type="spellEnd"/>
+      <w:r>
+        <w:t xml:space="preserve"> en lugar de concatenar </w:t>
+      </w:r>
+      <w:proofErr w:type="spellStart"/>
+      <w:r>
+        <w:t>strings</w:t>
+      </w:r>
+      <w:proofErr w:type="spellEnd"/>
+      <w:r>
+        <w:t xml:space="preserve">. </w:t>
       </w:r>
     </w:p>
     <w:p/>
@@ -2927,7 +4744,15 @@
         </w:numPr>
       </w:pPr>
       <w:r>
-        <w:t>Me hubiera gustado que utilices al operador ternario, por ejemplo, en el ejercicio nro 5:</w:t>
+        <w:t xml:space="preserve">Me hubiera gustado que utilices al operador ternario, por ejemplo, en el ejercicio </w:t>
+      </w:r>
+      <w:proofErr w:type="spellStart"/>
+      <w:r>
+        <w:t>nro</w:t>
+      </w:r>
+      <w:proofErr w:type="spellEnd"/>
+      <w:r>
+        <w:t xml:space="preserve"> 5:</w:t>
       </w:r>
       <w:r>
         <w:tab/>
@@ -2938,16 +4763,42 @@
       <w:pPr>
         <w:ind w:left="1416"/>
       </w:pPr>
-      <w:r>
-        <w:t>const estado = promedio &gt;= 6 ? "Aprobado" : "Reprobado";</w:t>
+      <w:proofErr w:type="spellStart"/>
+      <w:r>
+        <w:t>const</w:t>
+      </w:r>
+      <w:proofErr w:type="spellEnd"/>
+      <w:r>
+        <w:t xml:space="preserve"> estado = promedio &gt;= </w:t>
+      </w:r>
+      <w:proofErr w:type="gramStart"/>
+      <w:r>
+        <w:t>6 ?</w:t>
+      </w:r>
+      <w:proofErr w:type="gramEnd"/>
+      <w:r>
+        <w:t xml:space="preserve"> "Aprobado</w:t>
+      </w:r>
+      <w:proofErr w:type="gramStart"/>
+      <w:r>
+        <w:t>" :</w:t>
+      </w:r>
+      <w:proofErr w:type="gramEnd"/>
+      <w:r>
+        <w:t xml:space="preserve"> "Reprobado";</w:t>
       </w:r>
     </w:p>
     <w:p>
       <w:pPr>
         <w:ind w:left="1416"/>
       </w:pPr>
-      <w:r>
-        <w:t>console.log(`Estado: ${estado}`);</w:t>
+      <w:proofErr w:type="gramStart"/>
+      <w:r>
+        <w:t>console.log(</w:t>
+      </w:r>
+      <w:proofErr w:type="gramEnd"/>
+      <w:r>
+        <w:t>`Estado: ${estado}`);</w:t>
       </w:r>
     </w:p>
     <w:p>
@@ -2970,7 +4821,31 @@
         </w:numPr>
       </w:pPr>
       <w:r>
-        <w:t>En el Ejercicio nro 10 podes realizar la sumatoria de notas en el primer bucle for junto con el console.log() :</w:t>
+        <w:t xml:space="preserve">En el Ejercicio </w:t>
+      </w:r>
+      <w:proofErr w:type="spellStart"/>
+      <w:r>
+        <w:t>nro</w:t>
+      </w:r>
+      <w:proofErr w:type="spellEnd"/>
+      <w:r>
+        <w:t xml:space="preserve"> 10 podes realizar la sumatoria de notas en el primer bucle </w:t>
+      </w:r>
+      <w:proofErr w:type="spellStart"/>
+      <w:r>
+        <w:t>for</w:t>
+      </w:r>
+      <w:proofErr w:type="spellEnd"/>
+      <w:r>
+        <w:t xml:space="preserve"> junto con el </w:t>
+      </w:r>
+      <w:proofErr w:type="gramStart"/>
+      <w:r>
+        <w:t>console.log(</w:t>
+      </w:r>
+      <w:proofErr w:type="gramEnd"/>
+      <w:r>
+        <w:t>) :</w:t>
       </w:r>
     </w:p>
     <w:p>
@@ -2985,11 +4860,47 @@
           <w:lang w:val="en-US"/>
         </w:rPr>
       </w:pPr>
+      <w:proofErr w:type="gramStart"/>
       <w:r>
         <w:rPr>
           <w:lang w:val="en-US"/>
         </w:rPr>
-        <w:t>for(let materia in calificaciones){</w:t>
+        <w:t>for(</w:t>
+      </w:r>
+      <w:proofErr w:type="gramEnd"/>
+      <w:r>
+        <w:rPr>
+          <w:lang w:val="en-US"/>
+        </w:rPr>
+        <w:t xml:space="preserve">let </w:t>
+      </w:r>
+      <w:proofErr w:type="spellStart"/>
+      <w:r>
+        <w:rPr>
+          <w:lang w:val="en-US"/>
+        </w:rPr>
+        <w:t>materia</w:t>
+      </w:r>
+      <w:proofErr w:type="spellEnd"/>
+      <w:r>
+        <w:rPr>
+          <w:lang w:val="en-US"/>
+        </w:rPr>
+        <w:t xml:space="preserve"> in </w:t>
+      </w:r>
+      <w:proofErr w:type="spellStart"/>
+      <w:r>
+        <w:rPr>
+          <w:lang w:val="en-US"/>
+        </w:rPr>
+        <w:t>calificaciones</w:t>
+      </w:r>
+      <w:proofErr w:type="spellEnd"/>
+      <w:r>
+        <w:rPr>
+          <w:lang w:val="en-US"/>
+        </w:rPr>
+        <w:t>){</w:t>
       </w:r>
     </w:p>
     <w:p>
@@ -3002,8 +4913,13 @@
         </w:rPr>
         <w:t xml:space="preserve">    </w:t>
       </w:r>
-      <w:r>
-        <w:t>console.log(materia, ":", calificaciones[materia]);</w:t>
+      <w:proofErr w:type="gramStart"/>
+      <w:r>
+        <w:t>console.log(</w:t>
+      </w:r>
+      <w:proofErr w:type="gramEnd"/>
+      <w:r>
+        <w:t>materia, ":", calificaciones[materia]);</w:t>
       </w:r>
     </w:p>
     <w:p>
@@ -3011,6 +4927,7 @@
         <w:ind w:left="1416"/>
       </w:pPr>
       <w:r>
+        <w:lastRenderedPageBreak/>
         <w:t xml:space="preserve">    suma += calificaciones[materia];</w:t>
       </w:r>
     </w:p>
@@ -3027,7 +4944,6 @@
     <w:p/>
     <w:p>
       <w:r>
-        <w:lastRenderedPageBreak/>
         <w:t>Muy buen trabajo ¡</w:t>
       </w:r>
     </w:p>
@@ -3085,6 +5001,7 @@
           <w:rFonts w:ascii="Segoe UI Emoji" w:hAnsi="Segoe UI Emoji" w:cs="Segoe UI Emoji"/>
         </w:rPr>
       </w:pPr>
+      <w:proofErr w:type="gramStart"/>
       <w:r>
         <w:rPr>
           <w:rFonts w:ascii="Segoe UI Emoji" w:hAnsi="Segoe UI Emoji" w:cs="Segoe UI Emoji"/>
@@ -3092,7 +5009,11 @@
         <w:t>🎉</w:t>
       </w:r>
       <w:r>
-        <w:t xml:space="preserve">¡Felicitaciones por la entrega del Desafío 03! </w:t>
+        <w:t>¡</w:t>
+      </w:r>
+      <w:proofErr w:type="gramEnd"/>
+      <w:r>
+        <w:t xml:space="preserve">Felicitaciones por la entrega del Desafío 03! </w:t>
       </w:r>
       <w:r>
         <w:rPr>
@@ -3110,13 +5031,45 @@
     <w:p/>
     <w:p>
       <w:r>
-        <w:t>La estructura HTML esta impecable, destaco la correcta implementación de contenedores semánticos como main, section, footer, etc. El manejo de listas, textos y títulos es correcto.</w:t>
-      </w:r>
-    </w:p>
-    <w:p/>
-    <w:p>
-      <w:r>
-        <w:t>La barra de navegación principal quedo ok, los links configurados con estado hover como se solicitó.</w:t>
+        <w:t xml:space="preserve">La estructura HTML esta impecable, destaco la correcta implementación de contenedores semánticos como </w:t>
+      </w:r>
+      <w:proofErr w:type="spellStart"/>
+      <w:r>
+        <w:t>main</w:t>
+      </w:r>
+      <w:proofErr w:type="spellEnd"/>
+      <w:r>
+        <w:t xml:space="preserve">, </w:t>
+      </w:r>
+      <w:proofErr w:type="spellStart"/>
+      <w:r>
+        <w:t>section</w:t>
+      </w:r>
+      <w:proofErr w:type="spellEnd"/>
+      <w:r>
+        <w:t xml:space="preserve">, </w:t>
+      </w:r>
+      <w:proofErr w:type="spellStart"/>
+      <w:r>
+        <w:t>footer</w:t>
+      </w:r>
+      <w:proofErr w:type="spellEnd"/>
+      <w:r>
+        <w:t>, etc. El manejo de listas, textos y títulos es correcto.</w:t>
+      </w:r>
+    </w:p>
+    <w:p/>
+    <w:p>
+      <w:r>
+        <w:t xml:space="preserve">La barra de navegación principal quedo ok, los links configurados con estado </w:t>
+      </w:r>
+      <w:proofErr w:type="spellStart"/>
+      <w:r>
+        <w:t>hover</w:t>
+      </w:r>
+      <w:proofErr w:type="spellEnd"/>
+      <w:r>
+        <w:t xml:space="preserve"> como se solicitó.</w:t>
       </w:r>
     </w:p>
     <w:p/>
@@ -3128,7 +5081,23 @@
     <w:p/>
     <w:p>
       <w:r>
-        <w:t>Los estilos solicitados tanto en colores, fuentes y dimensiones quedaron ok, también aplicaste correctamente las propiedades de box model. EL layout quedó responsivo como se solicitó en enunciado.</w:t>
+        <w:t xml:space="preserve">Los estilos solicitados tanto en colores, fuentes y dimensiones quedaron ok, también aplicaste correctamente las propiedades de box </w:t>
+      </w:r>
+      <w:proofErr w:type="spellStart"/>
+      <w:r>
+        <w:t>model</w:t>
+      </w:r>
+      <w:proofErr w:type="spellEnd"/>
+      <w:r>
+        <w:t xml:space="preserve">. EL </w:t>
+      </w:r>
+      <w:proofErr w:type="spellStart"/>
+      <w:r>
+        <w:t>layout</w:t>
+      </w:r>
+      <w:proofErr w:type="spellEnd"/>
+      <w:r>
+        <w:t xml:space="preserve"> quedó responsivo como se solicitó en enunciado.</w:t>
       </w:r>
     </w:p>
     <w:p/>
@@ -3168,30 +5137,59 @@
           <w:bCs/>
         </w:rPr>
       </w:pPr>
-      <w:r>
-        <w:rPr>
-          <w:rFonts w:ascii="Segoe UI Emoji" w:hAnsi="Segoe UI Emoji" w:cs="Segoe UI Emoji"/>
-          <w:b/>
-          <w:bCs/>
-        </w:rPr>
-        <w:t>Pousadas Bernardis Juan Manuel</w:t>
-      </w:r>
-    </w:p>
-    <w:p>
-      <w:pPr>
-        <w:rPr>
-          <w:rFonts w:ascii="Segoe UI Emoji" w:hAnsi="Segoe UI Emoji" w:cs="Segoe UI Emoji"/>
-          <w:b/>
-          <w:bCs/>
-        </w:rPr>
-      </w:pPr>
-    </w:p>
-    <w:p>
-      <w:pPr>
-        <w:rPr>
-          <w:rFonts w:ascii="Segoe UI Emoji" w:hAnsi="Segoe UI Emoji" w:cs="Segoe UI Emoji"/>
-        </w:rPr>
-      </w:pPr>
+      <w:proofErr w:type="spellStart"/>
+      <w:r>
+        <w:rPr>
+          <w:rFonts w:ascii="Segoe UI Emoji" w:hAnsi="Segoe UI Emoji" w:cs="Segoe UI Emoji"/>
+          <w:b/>
+          <w:bCs/>
+        </w:rPr>
+        <w:t>Pousadas</w:t>
+      </w:r>
+      <w:proofErr w:type="spellEnd"/>
+      <w:r>
+        <w:rPr>
+          <w:rFonts w:ascii="Segoe UI Emoji" w:hAnsi="Segoe UI Emoji" w:cs="Segoe UI Emoji"/>
+          <w:b/>
+          <w:bCs/>
+        </w:rPr>
+        <w:t xml:space="preserve"> </w:t>
+      </w:r>
+      <w:proofErr w:type="spellStart"/>
+      <w:r>
+        <w:rPr>
+          <w:rFonts w:ascii="Segoe UI Emoji" w:hAnsi="Segoe UI Emoji" w:cs="Segoe UI Emoji"/>
+          <w:b/>
+          <w:bCs/>
+        </w:rPr>
+        <w:t>Bernardis</w:t>
+      </w:r>
+      <w:proofErr w:type="spellEnd"/>
+      <w:r>
+        <w:rPr>
+          <w:rFonts w:ascii="Segoe UI Emoji" w:hAnsi="Segoe UI Emoji" w:cs="Segoe UI Emoji"/>
+          <w:b/>
+          <w:bCs/>
+        </w:rPr>
+        <w:t xml:space="preserve"> Juan Manuel</w:t>
+      </w:r>
+    </w:p>
+    <w:p>
+      <w:pPr>
+        <w:rPr>
+          <w:rFonts w:ascii="Segoe UI Emoji" w:hAnsi="Segoe UI Emoji" w:cs="Segoe UI Emoji"/>
+          <w:b/>
+          <w:bCs/>
+        </w:rPr>
+      </w:pPr>
+    </w:p>
+    <w:p>
+      <w:pPr>
+        <w:rPr>
+          <w:rFonts w:ascii="Segoe UI Emoji" w:hAnsi="Segoe UI Emoji" w:cs="Segoe UI Emoji"/>
+        </w:rPr>
+      </w:pPr>
+      <w:proofErr w:type="gramStart"/>
       <w:r>
         <w:rPr>
           <w:rFonts w:ascii="Segoe UI Emoji" w:hAnsi="Segoe UI Emoji" w:cs="Segoe UI Emoji"/>
@@ -3199,7 +5197,11 @@
         <w:t>🎉</w:t>
       </w:r>
       <w:r>
-        <w:t xml:space="preserve">¡Felicitaciones por la entrega del Desafío 06! </w:t>
+        <w:t>¡</w:t>
+      </w:r>
+      <w:proofErr w:type="gramEnd"/>
+      <w:r>
+        <w:t xml:space="preserve">Felicitaciones por la entrega del Desafío 06! </w:t>
       </w:r>
       <w:r>
         <w:rPr>
@@ -3217,7 +5219,55 @@
     <w:p/>
     <w:p>
       <w:r>
-        <w:t>Correcta la implementación de estructuras condicionales “if”, “else if”, “else” con multiples ramas asi como “switch/case”.</w:t>
+        <w:t>Correcta la implementación de estructuras condicionales “</w:t>
+      </w:r>
+      <w:proofErr w:type="spellStart"/>
+      <w:r>
+        <w:t>if</w:t>
+      </w:r>
+      <w:proofErr w:type="spellEnd"/>
+      <w:r>
+        <w:t>”, “</w:t>
+      </w:r>
+      <w:proofErr w:type="spellStart"/>
+      <w:r>
+        <w:t>else</w:t>
+      </w:r>
+      <w:proofErr w:type="spellEnd"/>
+      <w:r>
+        <w:t xml:space="preserve"> </w:t>
+      </w:r>
+      <w:proofErr w:type="spellStart"/>
+      <w:r>
+        <w:t>if</w:t>
+      </w:r>
+      <w:proofErr w:type="spellEnd"/>
+      <w:r>
+        <w:t>”, “</w:t>
+      </w:r>
+      <w:proofErr w:type="spellStart"/>
+      <w:r>
+        <w:t>else</w:t>
+      </w:r>
+      <w:proofErr w:type="spellEnd"/>
+      <w:r>
+        <w:t xml:space="preserve">” con </w:t>
+      </w:r>
+      <w:proofErr w:type="spellStart"/>
+      <w:r>
+        <w:t>multiples</w:t>
+      </w:r>
+      <w:proofErr w:type="spellEnd"/>
+      <w:r>
+        <w:t xml:space="preserve"> ramas </w:t>
+      </w:r>
+      <w:proofErr w:type="spellStart"/>
+      <w:r>
+        <w:t>asi</w:t>
+      </w:r>
+      <w:proofErr w:type="spellEnd"/>
+      <w:r>
+        <w:t xml:space="preserve"> como “switch/case”.</w:t>
       </w:r>
     </w:p>
     <w:p/>
@@ -3229,7 +5279,31 @@
     <w:p/>
     <w:p>
       <w:r>
-        <w:t>Buenísimo que te manejaste con template literals en lugar de concatenar strings.</w:t>
+        <w:t xml:space="preserve">Buenísimo que te manejaste con </w:t>
+      </w:r>
+      <w:proofErr w:type="spellStart"/>
+      <w:r>
+        <w:t>template</w:t>
+      </w:r>
+      <w:proofErr w:type="spellEnd"/>
+      <w:r>
+        <w:t xml:space="preserve"> </w:t>
+      </w:r>
+      <w:proofErr w:type="spellStart"/>
+      <w:r>
+        <w:t>literals</w:t>
+      </w:r>
+      <w:proofErr w:type="spellEnd"/>
+      <w:r>
+        <w:t xml:space="preserve"> en lugar de concatenar </w:t>
+      </w:r>
+      <w:proofErr w:type="spellStart"/>
+      <w:r>
+        <w:t>strings</w:t>
+      </w:r>
+      <w:proofErr w:type="spellEnd"/>
+      <w:r>
+        <w:t>.</w:t>
       </w:r>
     </w:p>
     <w:p/>
@@ -3267,8 +5341,34 @@
       <w:pPr>
         <w:ind w:left="2124"/>
       </w:pPr>
-      <w:r>
-        <w:t>let mensaje = formularioValido ? "Valido" : "invalido";</w:t>
+      <w:proofErr w:type="spellStart"/>
+      <w:r>
+        <w:t>let</w:t>
+      </w:r>
+      <w:proofErr w:type="spellEnd"/>
+      <w:r>
+        <w:t xml:space="preserve"> mensaje = </w:t>
+      </w:r>
+      <w:proofErr w:type="spellStart"/>
+      <w:proofErr w:type="gramStart"/>
+      <w:r>
+        <w:t>formularioValido</w:t>
+      </w:r>
+      <w:proofErr w:type="spellEnd"/>
+      <w:r>
+        <w:t xml:space="preserve"> ?</w:t>
+      </w:r>
+      <w:proofErr w:type="gramEnd"/>
+      <w:r>
+        <w:t xml:space="preserve"> "Valido</w:t>
+      </w:r>
+      <w:proofErr w:type="gramStart"/>
+      <w:r>
+        <w:t>" :</w:t>
+      </w:r>
+      <w:proofErr w:type="gramEnd"/>
+      <w:r>
+        <w:t xml:space="preserve"> "invalido";</w:t>
       </w:r>
     </w:p>
     <w:p>
@@ -3321,23 +5421,34 @@
           <w:bCs/>
         </w:rPr>
       </w:pPr>
-      <w:r>
-        <w:rPr>
-          <w:rFonts w:ascii="Segoe UI Emoji" w:hAnsi="Segoe UI Emoji" w:cs="Segoe UI Emoji"/>
-          <w:b/>
-          <w:bCs/>
-        </w:rPr>
-        <w:t>Guzman de la Cruz Adriano Arturo</w:t>
-      </w:r>
-    </w:p>
-    <w:p/>
-    <w:p/>
-    <w:p>
-      <w:pPr>
-        <w:rPr>
-          <w:rFonts w:ascii="Segoe UI Emoji" w:hAnsi="Segoe UI Emoji" w:cs="Segoe UI Emoji"/>
-        </w:rPr>
-      </w:pPr>
+      <w:proofErr w:type="spellStart"/>
+      <w:r>
+        <w:rPr>
+          <w:rFonts w:ascii="Segoe UI Emoji" w:hAnsi="Segoe UI Emoji" w:cs="Segoe UI Emoji"/>
+          <w:b/>
+          <w:bCs/>
+        </w:rPr>
+        <w:t>Guzman</w:t>
+      </w:r>
+      <w:proofErr w:type="spellEnd"/>
+      <w:r>
+        <w:rPr>
+          <w:rFonts w:ascii="Segoe UI Emoji" w:hAnsi="Segoe UI Emoji" w:cs="Segoe UI Emoji"/>
+          <w:b/>
+          <w:bCs/>
+        </w:rPr>
+        <w:t xml:space="preserve"> de la Cruz Adriano Arturo</w:t>
+      </w:r>
+    </w:p>
+    <w:p/>
+    <w:p/>
+    <w:p>
+      <w:pPr>
+        <w:rPr>
+          <w:rFonts w:ascii="Segoe UI Emoji" w:hAnsi="Segoe UI Emoji" w:cs="Segoe UI Emoji"/>
+        </w:rPr>
+      </w:pPr>
+      <w:proofErr w:type="gramStart"/>
       <w:r>
         <w:rPr>
           <w:rFonts w:ascii="Segoe UI Emoji" w:hAnsi="Segoe UI Emoji" w:cs="Segoe UI Emoji"/>
@@ -3345,7 +5456,11 @@
         <w:t>🎉</w:t>
       </w:r>
       <w:r>
-        <w:t xml:space="preserve">¡Felicitaciones por la entrega del Desafío 07! </w:t>
+        <w:t>¡</w:t>
+      </w:r>
+      <w:proofErr w:type="gramEnd"/>
+      <w:r>
+        <w:t xml:space="preserve">Felicitaciones por la entrega del Desafío 07! </w:t>
       </w:r>
       <w:r>
         <w:rPr>
@@ -3357,16 +5472,37 @@
     <w:p/>
     <w:p>
       <w:r>
-        <w:t>Adriano</w:t>
-      </w:r>
-      <w:r>
-        <w:t>, excelente trabajo, te felicito por el compromiso en realizar las entregas.</w:t>
-      </w:r>
-    </w:p>
-    <w:p/>
-    <w:p>
-      <w:r>
-        <w:t xml:space="preserve">Excelente la implementación de métodos para recorrer para arrays y objetos, diferenciaste correctamente los métodos splice y slice. </w:t>
+        <w:t>Adriano, excelente trabajo, te felicito por el compromiso en realizar las entregas.</w:t>
+      </w:r>
+    </w:p>
+    <w:p/>
+    <w:p>
+      <w:r>
+        <w:t xml:space="preserve">Excelente la implementación de métodos para recorrer para </w:t>
+      </w:r>
+      <w:proofErr w:type="spellStart"/>
+      <w:r>
+        <w:t>arrays</w:t>
+      </w:r>
+      <w:proofErr w:type="spellEnd"/>
+      <w:r>
+        <w:t xml:space="preserve"> y objetos, diferenciaste correctamente los métodos </w:t>
+      </w:r>
+      <w:proofErr w:type="spellStart"/>
+      <w:r>
+        <w:t>splice</w:t>
+      </w:r>
+      <w:proofErr w:type="spellEnd"/>
+      <w:r>
+        <w:t xml:space="preserve"> y </w:t>
+      </w:r>
+      <w:proofErr w:type="spellStart"/>
+      <w:r>
+        <w:t>slice</w:t>
+      </w:r>
+      <w:proofErr w:type="spellEnd"/>
+      <w:r>
+        <w:t xml:space="preserve">. </w:t>
       </w:r>
     </w:p>
     <w:p/>
@@ -3378,7 +5514,31 @@
     <w:p/>
     <w:p>
       <w:r>
-        <w:t xml:space="preserve">Buenísimo que te manejaste con template literals en lugar de concatenar strings. </w:t>
+        <w:t xml:space="preserve">Buenísimo que te manejaste con </w:t>
+      </w:r>
+      <w:proofErr w:type="spellStart"/>
+      <w:r>
+        <w:t>template</w:t>
+      </w:r>
+      <w:proofErr w:type="spellEnd"/>
+      <w:r>
+        <w:t xml:space="preserve"> </w:t>
+      </w:r>
+      <w:proofErr w:type="spellStart"/>
+      <w:r>
+        <w:t>literals</w:t>
+      </w:r>
+      <w:proofErr w:type="spellEnd"/>
+      <w:r>
+        <w:t xml:space="preserve"> en lugar de concatenar </w:t>
+      </w:r>
+      <w:proofErr w:type="spellStart"/>
+      <w:r>
+        <w:t>strings</w:t>
+      </w:r>
+      <w:proofErr w:type="spellEnd"/>
+      <w:r>
+        <w:t xml:space="preserve">. </w:t>
       </w:r>
     </w:p>
     <w:p/>
@@ -3404,7 +5564,15 @@
         </w:numPr>
       </w:pPr>
       <w:r>
-        <w:t>Me hubiera gustado que utilices al operador ternario, por ejemplo, en el ejercicio nro 5:</w:t>
+        <w:t xml:space="preserve">Me hubiera gustado que utilices al operador ternario, por ejemplo, en el ejercicio </w:t>
+      </w:r>
+      <w:proofErr w:type="spellStart"/>
+      <w:r>
+        <w:t>nro</w:t>
+      </w:r>
+      <w:proofErr w:type="spellEnd"/>
+      <w:r>
+        <w:t xml:space="preserve"> 5:</w:t>
       </w:r>
       <w:r>
         <w:tab/>
@@ -3415,16 +5583,42 @@
       <w:pPr>
         <w:ind w:left="1416"/>
       </w:pPr>
-      <w:r>
-        <w:t>const estado = promedio &gt;= 6 ? "Aprobado" : "Reprobado";</w:t>
+      <w:proofErr w:type="spellStart"/>
+      <w:r>
+        <w:t>const</w:t>
+      </w:r>
+      <w:proofErr w:type="spellEnd"/>
+      <w:r>
+        <w:t xml:space="preserve"> estado = promedio &gt;= </w:t>
+      </w:r>
+      <w:proofErr w:type="gramStart"/>
+      <w:r>
+        <w:t>6 ?</w:t>
+      </w:r>
+      <w:proofErr w:type="gramEnd"/>
+      <w:r>
+        <w:t xml:space="preserve"> "Aprobado</w:t>
+      </w:r>
+      <w:proofErr w:type="gramStart"/>
+      <w:r>
+        <w:t>" :</w:t>
+      </w:r>
+      <w:proofErr w:type="gramEnd"/>
+      <w:r>
+        <w:t xml:space="preserve"> "Reprobado";</w:t>
       </w:r>
     </w:p>
     <w:p>
       <w:pPr>
         <w:ind w:left="1416"/>
       </w:pPr>
-      <w:r>
-        <w:t>console.log(`Estado: ${estado}`);</w:t>
+      <w:proofErr w:type="gramStart"/>
+      <w:r>
+        <w:t>console.log(</w:t>
+      </w:r>
+      <w:proofErr w:type="gramEnd"/>
+      <w:r>
+        <w:t>`Estado: ${estado}`);</w:t>
       </w:r>
     </w:p>
     <w:p>
@@ -3437,6 +5631,7 @@
     <w:p/>
     <w:p>
       <w:r>
+        <w:lastRenderedPageBreak/>
         <w:t>Muy buen trabajo ¡</w:t>
       </w:r>
     </w:p>
@@ -3465,7 +5660,7 @@
 </file>
 
 <file path=word/numbering.xml><?xml version="1.0" encoding="utf-8"?>
-<w:numbering xmlns:wpc="http://schemas.microsoft.com/office/word/2010/wordprocessingCanvas" xmlns:cx="http://schemas.microsoft.com/office/drawing/2014/chartex" xmlns:cx1="http://schemas.microsoft.com/office/drawing/2015/9/8/chartex" xmlns:cx2="http://schemas.microsoft.com/office/drawing/2015/10/21/chartex" xmlns:cx3="http://schemas.microsoft.com/office/drawing/2016/5/9/chartex" xmlns:cx4="http://schemas.microsoft.com/office/drawing/2016/5/10/chartex" xmlns:cx5="http://schemas.microsoft.com/office/drawing/2016/5/11/chartex" xmlns:cx6="http://schemas.microsoft.com/office/drawing/2016/5/12/chartex" xmlns:cx7="http://schemas.microsoft.com/office/drawing/2016/5/13/chartex" xmlns:cx8="http://schemas.microsoft.com/office/drawing/2016/5/14/chartex" xmlns:mc="http://schemas.openxmlformats.org/markup-compatibility/2006" xmlns:aink="http://schemas.microsoft.com/office/drawing/2016/ink" xmlns:am3d="http://schemas.microsoft.com/office/drawing/2017/model3d" xmlns:o="urn:schemas-microsoft-com:office:office" xmlns:oel="http://schemas.microsoft.com/office/2019/extlst" xmlns:r="http://schemas.openxmlformats.org/officeDocument/2006/relationships" xmlns:m="http://schemas.openxmlformats.org/officeDocument/2006/math" xmlns:v="urn:schemas-microsoft-com:vml" xmlns:wp14="http://schemas.microsoft.com/office/word/2010/wordprocessingDrawing" xmlns:wp="http://schemas.openxmlformats.org/drawingml/2006/wordprocessingDrawing" xmlns:w10="urn:schemas-microsoft-com:office:word" xmlns:w="http://schemas.openxmlformats.org/wordprocessingml/2006/main" xmlns:w14="http://schemas.microsoft.com/office/word/2010/wordml" xmlns:w15="http://schemas.microsoft.com/office/word/2012/wordml" xmlns:w16cei="http://schemas.microsoft.com/office/word/2026/wordml/cei" xmlns:w16cex="http://schemas.microsoft.com/office/word/2018/wordml/cex" xmlns:w16cid="http://schemas.microsoft.com/office/word/2016/wordml/cid" xmlns:w16="http://schemas.microsoft.com/office/word/2018/wordml" xmlns:w16du="http://schemas.microsoft.com/office/word/2023/wordml/word16du" xmlns:w16sdtdh="http://schemas.microsoft.com/office/word/2020/wordml/sdtdatahash" xmlns:w16sdtfl="http://schemas.microsoft.com/office/word/2024/wordml/sdtformatlock" xmlns:w16se="http://schemas.microsoft.com/office/word/2015/wordml/symex" xmlns:wpg="http://schemas.microsoft.com/office/word/2010/wordprocessingGroup" xmlns:wpi="http://schemas.microsoft.com/office/word/2010/wordprocessingInk" xmlns:wne="http://schemas.microsoft.com/office/word/2006/wordml" xmlns:wps="http://schemas.microsoft.com/office/word/2010/wordprocessingShape" mc:Ignorable="w14 w15 w16se w16cid w16 w16cex w16sdtdh w16sdtfl w16du wp14">
+<w:numbering xmlns:wpc="http://schemas.microsoft.com/office/word/2010/wordprocessingCanvas" xmlns:cx="http://schemas.microsoft.com/office/drawing/2014/chartex" xmlns:cx1="http://schemas.microsoft.com/office/drawing/2015/9/8/chartex" xmlns:cx2="http://schemas.microsoft.com/office/drawing/2015/10/21/chartex" xmlns:cx3="http://schemas.microsoft.com/office/drawing/2016/5/9/chartex" xmlns:cx4="http://schemas.microsoft.com/office/drawing/2016/5/10/chartex" xmlns:cx5="http://schemas.microsoft.com/office/drawing/2016/5/11/chartex" xmlns:cx6="http://schemas.microsoft.com/office/drawing/2016/5/12/chartex" xmlns:cx7="http://schemas.microsoft.com/office/drawing/2016/5/13/chartex" xmlns:cx8="http://schemas.microsoft.com/office/drawing/2016/5/14/chartex" xmlns:mc="http://schemas.openxmlformats.org/markup-compatibility/2006" xmlns:aink="http://schemas.microsoft.com/office/drawing/2016/ink" xmlns:am3d="http://schemas.microsoft.com/office/drawing/2017/model3d" xmlns:o="urn:schemas-microsoft-com:office:office" xmlns:oel="http://schemas.microsoft.com/office/2019/extlst" xmlns:r="http://schemas.openxmlformats.org/officeDocument/2006/relationships" xmlns:m="http://schemas.openxmlformats.org/officeDocument/2006/math" xmlns:v="urn:schemas-microsoft-com:vml" xmlns:wp14="http://schemas.microsoft.com/office/word/2010/wordprocessingDrawing" xmlns:wp="http://schemas.openxmlformats.org/drawingml/2006/wordprocessingDrawing" xmlns:w10="urn:schemas-microsoft-com:office:word" xmlns:w="http://schemas.openxmlformats.org/wordprocessingml/2006/main" xmlns:w14="http://schemas.microsoft.com/office/word/2010/wordml" xmlns:w15="http://schemas.microsoft.com/office/word/2012/wordml" xmlns:w16cex="http://schemas.microsoft.com/office/word/2018/wordml/cex" xmlns:w16cid="http://schemas.microsoft.com/office/word/2016/wordml/cid" xmlns:w16="http://schemas.microsoft.com/office/word/2018/wordml" xmlns:w16sdtdh="http://schemas.microsoft.com/office/word/2020/wordml/sdtdatahash" xmlns:w16se="http://schemas.microsoft.com/office/word/2015/wordml/symex" xmlns:wpg="http://schemas.microsoft.com/office/word/2010/wordprocessingGroup" xmlns:wpi="http://schemas.microsoft.com/office/word/2010/wordprocessingInk" xmlns:wne="http://schemas.microsoft.com/office/word/2006/wordml" xmlns:wps="http://schemas.microsoft.com/office/word/2010/wordprocessingShape" mc:Ignorable="w14 w15 w16se w16cid w16 w16cex w16sdtdh wp14">
   <w:abstractNum w:abstractNumId="0" w15:restartNumberingAfterBreak="0">
     <w:nsid w:val="07E93321"/>
     <w:multiLevelType w:val="hybridMultilevel"/>
@@ -4166,7 +6361,7 @@
 </file>
 
 <file path=word/styles.xml><?xml version="1.0" encoding="utf-8"?>
-<w:styles xmlns:mc="http://schemas.openxmlformats.org/markup-compatibility/2006" xmlns:r="http://schemas.openxmlformats.org/officeDocument/2006/relationships" xmlns:w="http://schemas.openxmlformats.org/wordprocessingml/2006/main" xmlns:w14="http://schemas.microsoft.com/office/word/2010/wordml" xmlns:w15="http://schemas.microsoft.com/office/word/2012/wordml" xmlns:w16cex="http://schemas.microsoft.com/office/word/2018/wordml/cex" xmlns:w16cid="http://schemas.microsoft.com/office/word/2016/wordml/cid" xmlns:w16="http://schemas.microsoft.com/office/word/2018/wordml" xmlns:w16du="http://schemas.microsoft.com/office/word/2023/wordml/word16du" xmlns:w16sdtdh="http://schemas.microsoft.com/office/word/2020/wordml/sdtdatahash" xmlns:w16sdtfl="http://schemas.microsoft.com/office/word/2024/wordml/sdtformatlock" xmlns:w16se="http://schemas.microsoft.com/office/word/2015/wordml/symex" mc:Ignorable="w14 w15 w16se w16cid w16 w16cex w16sdtdh w16sdtfl w16du">
+<w:styles xmlns:mc="http://schemas.openxmlformats.org/markup-compatibility/2006" xmlns:r="http://schemas.openxmlformats.org/officeDocument/2006/relationships" xmlns:w="http://schemas.openxmlformats.org/wordprocessingml/2006/main" xmlns:w14="http://schemas.microsoft.com/office/word/2010/wordml" xmlns:w15="http://schemas.microsoft.com/office/word/2012/wordml" xmlns:w16cex="http://schemas.microsoft.com/office/word/2018/wordml/cex" xmlns:w16cid="http://schemas.microsoft.com/office/word/2016/wordml/cid" xmlns:w16="http://schemas.microsoft.com/office/word/2018/wordml" xmlns:w16sdtdh="http://schemas.microsoft.com/office/word/2020/wordml/sdtdatahash" xmlns:w16se="http://schemas.microsoft.com/office/word/2015/wordml/symex" mc:Ignorable="w14 w15 w16se w16cid w16 w16cex w16sdtdh">
   <w:docDefaults>
     <w:rPrDefault>
       <w:rPr>
@@ -4572,6 +6767,7 @@
   <w:style w:type="character" w:default="1" w:styleId="Fuentedeprrafopredeter">
     <w:name w:val="Default Paragraph Font"/>
     <w:uiPriority w:val="1"/>
+    <w:semiHidden/>
     <w:unhideWhenUsed/>
   </w:style>
   <w:style w:type="table" w:default="1" w:styleId="Tablanormal">

</xml_diff>